<commit_message>
Added some discussion on global warming
</commit_message>
<xml_diff>
--- a/zabranjivanje_mesa.docx
+++ b/zabranjivanje_mesa.docx
@@ -64,6 +64,48 @@
         <w:bidi w:val="0"/>
         <w:jc w:val="center"/>
         <w:rPr>
+          <w:b w:val="false"/>
+          <w:bCs w:val="false"/>
+          <w:lang w:val="hr-HR"/>
+        </w:rPr>
+      </w:pPr>
+      <w:r>
+        <w:rPr>
+          <w:b w:val="false"/>
+          <w:bCs w:val="false"/>
+          <w:lang w:val="hr-HR"/>
+        </w:rPr>
+      </w:r>
+    </w:p>
+    <w:p>
+      <w:pPr>
+        <w:pStyle w:val="Normal"/>
+        <w:bidi w:val="0"/>
+        <w:jc w:val="center"/>
+        <w:rPr>
+          <w:b w:val="false"/>
+          <w:bCs w:val="false"/>
+          <w:highlight w:val="none"/>
+          <w:shd w:fill="FFFF00" w:val="clear"/>
+          <w:lang w:val="hr-HR"/>
+        </w:rPr>
+      </w:pPr>
+      <w:r>
+        <w:rPr>
+          <w:b w:val="false"/>
+          <w:bCs w:val="false"/>
+          <w:shd w:fill="FFFF00" w:val="clear"/>
+          <w:lang w:val="hr-HR"/>
+        </w:rPr>
+        <w:t>Ovako označene rečenice naknadno su dodane.</w:t>
+      </w:r>
+    </w:p>
+    <w:p>
+      <w:pPr>
+        <w:pStyle w:val="Normal"/>
+        <w:bidi w:val="0"/>
+        <w:jc w:val="center"/>
+        <w:rPr>
           <w:lang w:val="bs-BA"/>
         </w:rPr>
       </w:pPr>
@@ -603,33 +645,36 @@
         <w:rPr>
           <w:b w:val="false"/>
           <w:bCs w:val="false"/>
-          <w:lang w:val="hr-HR"/>
-        </w:rPr>
-        <w:t>Pa, kao prvo, intenzivan uzgoj životinja, ako išta, još je više usporediv s genocidom jer intenzivan uzgoj životinja ubija daleko više životinja nego što je nužno. Imate li Vi ikakve ideje o tome koliko glodavaca biva ubijeno u proizvodnji zrnja za stočnu hranu? Drugim riječima, nizašto, jer stvarno možemo bez toga? Kao drugo,</w:t>
-      </w:r>
-      <w:r>
-        <w:rPr>
-          <w:b w:val="false"/>
-          <w:bCs w:val="false"/>
-          <w:lang w:val="hr-HR"/>
-        </w:rPr>
-        <w:t xml:space="preserve"> zar t</w:t>
-      </w:r>
-      <w:r>
-        <w:rPr>
-          <w:b w:val="false"/>
-          <w:bCs w:val="false"/>
-          <w:lang w:val="hr-HR"/>
-        </w:rPr>
-        <w:t>a usporedba veganstva s genocidom</w:t>
-      </w:r>
-      <w:r>
-        <w:rPr>
-          <w:b w:val="false"/>
-          <w:bCs w:val="false"/>
-          <w:lang w:val="hr-HR"/>
-        </w:rPr>
-        <w:t xml:space="preserve"> nije kao da kažemo da je robovlasništvo nekom uvrnutom logikom bilo dobra stvar samo zato što, da nije bilo njega, većina se Afroamerikanaca koji danas postoje u Americi ne bi bila rodila?</w:t>
+          <w:shd w:fill="FFFF00" w:val="clear"/>
+          <w:lang w:val="hr-HR"/>
+        </w:rPr>
+        <w:t xml:space="preserve">Pa, kao prvo, intenzivan uzgoj životinja, ako išta, još je više usporediv s genocidom jer intenzivan uzgoj životinja ubija daleko više životinja nego što je nužno. Imate li Vi ikakve ideje o tome koliko glodavaca biva ubijeno u proizvodnji zrnja za stočnu hranu? Drugim riječima, nizašto, jer stvarno možemo bez toga? </w:t>
+      </w:r>
+      <w:r>
+        <w:rPr>
+          <w:b w:val="false"/>
+          <w:bCs w:val="false"/>
+          <w:shd w:fill="FFFF00" w:val="clear"/>
+          <w:lang w:val="hr-HR"/>
+        </w:rPr>
+        <w:t>Gotovo svi glodavci koje ubijamo ubijeni su radi stočne hrane.</w:t>
+      </w:r>
+      <w:r>
+        <w:rPr>
+          <w:b w:val="false"/>
+          <w:bCs w:val="false"/>
+          <w:shd w:fill="FFFF00" w:val="clear"/>
+          <w:lang w:val="hr-HR"/>
+        </w:rPr>
+        <w:t xml:space="preserve"> Kao drugo</w:t>
+      </w:r>
+      <w:r>
+        <w:rPr>
+          <w:b w:val="false"/>
+          <w:bCs w:val="false"/>
+          <w:lang w:val="hr-HR"/>
+        </w:rPr>
+        <w:t>, zar ta usporedba veganstva s genocidom nije kao da kažemo da je robovlasništvo nekom uvrnutom logikom bilo dobra stvar samo zato što, da nije bilo njega, većina se Afroamerikanaca koji danas postoje u Americi ne bi bila rodila?</w:t>
       </w:r>
     </w:p>
     <w:p>
@@ -817,6 +862,183 @@
           <w:bCs/>
           <w:lang w:val="hr-HR"/>
         </w:rPr>
+        <w:t xml:space="preserve">Huemer: </w:t>
+      </w:r>
+      <w:r>
+        <w:rPr>
+          <w:b w:val="false"/>
+          <w:bCs w:val="false"/>
+          <w:shd w:fill="FFFF00" w:val="clear"/>
+          <w:lang w:val="hr-HR"/>
+        </w:rPr>
+        <w:t>Što se tiče te kontroverze među epidemiolozima, mislim da je ona više religijske prirode nego znanstvene. Već je u antici bilo očito da narodi koji uzgajaju svinje češće oboljevaju od epidemija gripe nego narodi koji ne uzgajaju. Nije to Mojsije bez razloga rekao, nego zato što je promatrao primitivne statistike. I današnja znanost to potvrđuje, kad znamo kako nastaju novi sojevi ptičje gripe. Samo što je ljudima teško biti</w:t>
+      </w:r>
+      <w:r>
+        <w:rPr>
+          <w:b w:val="false"/>
+          <w:bCs w:val="false"/>
+          <w:i/>
+          <w:iCs/>
+          <w:shd w:fill="FFFF00" w:val="clear"/>
+          <w:lang w:val="hr-HR"/>
+        </w:rPr>
+        <w:t xml:space="preserve"> nuanced</w:t>
+      </w:r>
+      <w:r>
+        <w:rPr>
+          <w:b w:val="false"/>
+          <w:bCs w:val="false"/>
+          <w:i w:val="false"/>
+          <w:iCs w:val="false"/>
+          <w:shd w:fill="FFFF00" w:val="clear"/>
+          <w:lang w:val="hr-HR"/>
+        </w:rPr>
+        <w:t xml:space="preserve"> i reći da je Mojsije ipak u tim svojim dugačkim i uglavnom-besmislenim propovjedima ipak neke stvari pogodio </w:t>
+      </w:r>
+      <w:r>
+        <w:rPr>
+          <w:b w:val="false"/>
+          <w:bCs w:val="false"/>
+          <w:i/>
+          <w:iCs/>
+          <w:shd w:fill="FFFF00" w:val="clear"/>
+          <w:lang w:val="hr-HR"/>
+        </w:rPr>
+        <w:t xml:space="preserve">u sridu </w:t>
+      </w:r>
+      <w:r>
+        <w:rPr>
+          <w:b w:val="false"/>
+          <w:bCs w:val="false"/>
+          <w:i w:val="false"/>
+          <w:iCs w:val="false"/>
+          <w:shd w:fill="FFFF00" w:val="clear"/>
+          <w:lang w:val="hr-HR"/>
+        </w:rPr>
+        <w:t xml:space="preserve"> -- kao ta da su svinje posebno opasne životinje epidemiološki.</w:t>
+      </w:r>
+      <w:r>
+        <w:rPr>
+          <w:b w:val="false"/>
+          <w:bCs w:val="false"/>
+          <w:i/>
+          <w:iCs/>
+          <w:lang w:val="hr-HR"/>
+        </w:rPr>
+        <w:t xml:space="preserve"> </w:t>
+      </w:r>
+      <w:r>
+        <w:rPr>
+          <w:b w:val="false"/>
+          <w:bCs w:val="false"/>
+          <w:lang w:val="hr-HR"/>
+        </w:rPr>
+        <w:t xml:space="preserve">A </w:t>
+      </w:r>
+      <w:r>
+        <w:rPr>
+          <w:b w:val="false"/>
+          <w:bCs w:val="false"/>
+          <w:lang w:val="hr-HR"/>
+        </w:rPr>
+        <w:t>što se tiče tih nutricionalnih deficijencija,</w:t>
+      </w:r>
+      <w:r>
+        <w:rPr>
+          <w:b w:val="false"/>
+          <w:bCs w:val="false"/>
+          <w:lang w:val="hr-HR"/>
+        </w:rPr>
+        <w:t xml:space="preserve"> kako onda gotovo sve studije pokazuju da vegani i vegetarijanci imaju manji rizik od srčanog udara, a ne veći?</w:t>
+      </w:r>
+    </w:p>
+    <w:p>
+      <w:pPr>
+        <w:pStyle w:val="Normal"/>
+        <w:bidi w:val="0"/>
+        <w:ind w:hanging="900" w:start="900" w:end="0"/>
+        <w:jc w:val="start"/>
+        <w:rPr>
+          <w:b w:val="false"/>
+          <w:bCs w:val="false"/>
+          <w:lang w:val="hr-HR"/>
+        </w:rPr>
+      </w:pPr>
+      <w:r>
+        <w:rPr>
+          <w:b w:val="false"/>
+          <w:bCs w:val="false"/>
+          <w:lang w:val="hr-HR"/>
+        </w:rPr>
+      </w:r>
+    </w:p>
+    <w:p>
+      <w:pPr>
+        <w:pStyle w:val="Normal"/>
+        <w:bidi w:val="0"/>
+        <w:ind w:hanging="900" w:start="900" w:end="0"/>
+        <w:jc w:val="start"/>
+        <w:rPr>
+          <w:b w:val="false"/>
+          <w:bCs w:val="false"/>
+          <w:lang w:val="hr-HR"/>
+        </w:rPr>
+      </w:pPr>
+      <w:r>
+        <w:rPr>
+          <w:b/>
+          <w:bCs/>
+          <w:lang w:val="hr-HR"/>
+        </w:rPr>
+        <w:t>Caplan:</w:t>
+      </w:r>
+      <w:r>
+        <w:rPr>
+          <w:b w:val="false"/>
+          <w:bCs w:val="false"/>
+          <w:lang w:val="hr-HR"/>
+        </w:rPr>
+        <w:t xml:space="preserve"> A kako znate da to nije zbog drugih faktora? Što ako to nema veze sa zasićenim mastima u mesu, nego s drugim stvarima?</w:t>
+      </w:r>
+    </w:p>
+    <w:p>
+      <w:pPr>
+        <w:pStyle w:val="Normal"/>
+        <w:bidi w:val="0"/>
+        <w:ind w:hanging="900" w:start="900" w:end="0"/>
+        <w:jc w:val="start"/>
+        <w:rPr>
+          <w:b w:val="false"/>
+          <w:bCs w:val="false"/>
+          <w:lang w:val="hr-HR"/>
+        </w:rPr>
+      </w:pPr>
+      <w:r>
+        <w:rPr>
+          <w:b w:val="false"/>
+          <w:bCs w:val="false"/>
+          <w:lang w:val="hr-HR"/>
+        </w:rPr>
+      </w:r>
+    </w:p>
+    <w:p>
+      <w:pPr>
+        <w:pStyle w:val="Normal"/>
+        <w:bidi w:val="0"/>
+        <w:ind w:hanging="900" w:start="900" w:end="0"/>
+        <w:jc w:val="start"/>
+        <w:rPr>
+          <w:b w:val="false"/>
+          <w:bCs w:val="false"/>
+          <w:lang w:val="hr-HR"/>
+        </w:rPr>
+      </w:pPr>
+      <w:r>
+        <w:rPr>
+          <w:b/>
+          <w:bCs/>
+          <w:lang w:val="hr-HR"/>
+        </w:rPr>
         <w:t>Huemer:</w:t>
       </w:r>
       <w:r>
@@ -825,7 +1047,7 @@
           <w:bCs w:val="false"/>
           <w:lang w:val="hr-HR"/>
         </w:rPr>
-        <w:t xml:space="preserve"> A kako onda gotovo sve studije pokazuju da vegani i vegetarijanci imaju manji rizik od srčanog udara, a ne veći?</w:t>
+        <w:t xml:space="preserve"> Ali što to drugo može biti? Jasno je kako bi meso moglo biti otrov, to je zbog zasićenih masti, a nije ni najmanje jasno kako bi povrće moglo biti lijek ili čak protuotrov.</w:t>
       </w:r>
     </w:p>
     <w:p>
@@ -874,7 +1096,7 @@
           <w:bCs w:val="false"/>
           <w:lang w:val="hr-HR"/>
         </w:rPr>
-        <w:t xml:space="preserve"> A kako znate da to nije zbog drugih faktora? Što ako to nema veze sa zasićenim mastima u mesu, nego s drugim stvarima?</w:t>
+        <w:t xml:space="preserve"> Pa, obično se citira da to Vitamin K iz povrća spriječava srčane bolesti.</w:t>
       </w:r>
     </w:p>
     <w:p>
@@ -923,45 +1145,48 @@
           <w:bCs w:val="false"/>
           <w:lang w:val="hr-HR"/>
         </w:rPr>
-        <w:t xml:space="preserve"> Ali što to drugo može biti? Jasno je kako bi meso moglo biti otrov, to je zbog zasićenih masti, a nije ni najmanje jasno kako bi povrće moglo biti lijek ili čak protuotrov.</w:t>
-      </w:r>
-    </w:p>
-    <w:p>
-      <w:pPr>
-        <w:pStyle w:val="Normal"/>
-        <w:bidi w:val="0"/>
-        <w:ind w:hanging="900" w:start="900" w:end="0"/>
-        <w:jc w:val="start"/>
-        <w:rPr>
-          <w:b w:val="false"/>
-          <w:bCs w:val="false"/>
-          <w:lang w:val="hr-HR"/>
-        </w:rPr>
-      </w:pPr>
-      <w:r>
-        <w:rPr>
-          <w:b w:val="false"/>
-          <w:bCs w:val="false"/>
-          <w:lang w:val="hr-HR"/>
-        </w:rPr>
-      </w:r>
-    </w:p>
-    <w:p>
-      <w:pPr>
-        <w:pStyle w:val="Normal"/>
-        <w:bidi w:val="0"/>
-        <w:ind w:hanging="900" w:start="900" w:end="0"/>
-        <w:jc w:val="start"/>
-        <w:rPr>
-          <w:b w:val="false"/>
-          <w:bCs w:val="false"/>
-          <w:lang w:val="hr-HR"/>
-        </w:rPr>
-      </w:pPr>
-      <w:r>
-        <w:rPr>
-          <w:b/>
-          <w:bCs/>
+        <w:t xml:space="preserve"> A znate li Vi kako to ekstremni nedostatak Vitamina K, koji se, recimo, događa kod novorođenčadi i uzrokuje SIDS, uzrokuje srčane udare?</w:t>
+      </w:r>
+    </w:p>
+    <w:p>
+      <w:pPr>
+        <w:pStyle w:val="Normal"/>
+        <w:bidi w:val="0"/>
+        <w:ind w:hanging="900" w:start="900" w:end="0"/>
+        <w:jc w:val="start"/>
+        <w:rPr>
+          <w:b w:val="false"/>
+          <w:bCs w:val="false"/>
+          <w:lang w:val="hr-HR"/>
+        </w:rPr>
+      </w:pPr>
+      <w:r>
+        <w:rPr>
+          <w:b w:val="false"/>
+          <w:bCs w:val="false"/>
+          <w:lang w:val="hr-HR"/>
+        </w:rPr>
+      </w:r>
+    </w:p>
+    <w:p>
+      <w:pPr>
+        <w:pStyle w:val="Normal"/>
+        <w:bidi w:val="0"/>
+        <w:ind w:hanging="900" w:start="900" w:end="0"/>
+        <w:jc w:val="start"/>
+        <w:rPr>
+          <w:b w:val="false"/>
+          <w:bCs w:val="false"/>
+          <w:highlight w:val="none"/>
+          <w:shd w:fill="FFFF00" w:val="clear"/>
+          <w:lang w:val="hr-HR"/>
+        </w:rPr>
+      </w:pPr>
+      <w:r>
+        <w:rPr>
+          <w:b/>
+          <w:bCs/>
+          <w:shd w:fill="FFFF00" w:val="clear"/>
           <w:lang w:val="hr-HR"/>
         </w:rPr>
         <w:t>Caplan:</w:t>
@@ -970,47 +1195,54 @@
         <w:rPr>
           <w:b w:val="false"/>
           <w:bCs w:val="false"/>
-          <w:lang w:val="hr-HR"/>
-        </w:rPr>
-        <w:t xml:space="preserve"> Pa, obično se citira da to Vitamin K iz povrća spriječava srčane bolesti.</w:t>
-      </w:r>
-    </w:p>
-    <w:p>
-      <w:pPr>
-        <w:pStyle w:val="Normal"/>
-        <w:bidi w:val="0"/>
-        <w:ind w:hanging="900" w:start="900" w:end="0"/>
-        <w:jc w:val="start"/>
-        <w:rPr>
-          <w:b w:val="false"/>
-          <w:bCs w:val="false"/>
-          <w:lang w:val="hr-HR"/>
-        </w:rPr>
-      </w:pPr>
-      <w:r>
-        <w:rPr>
-          <w:b w:val="false"/>
-          <w:bCs w:val="false"/>
-          <w:lang w:val="hr-HR"/>
-        </w:rPr>
-      </w:r>
-    </w:p>
-    <w:p>
-      <w:pPr>
-        <w:pStyle w:val="Normal"/>
-        <w:bidi w:val="0"/>
-        <w:ind w:hanging="900" w:start="900" w:end="0"/>
-        <w:jc w:val="start"/>
-        <w:rPr>
-          <w:b w:val="false"/>
-          <w:bCs w:val="false"/>
-          <w:lang w:val="hr-HR"/>
-        </w:rPr>
-      </w:pPr>
-      <w:r>
-        <w:rPr>
-          <w:b/>
-          <w:bCs/>
+          <w:shd w:fill="FFFF00" w:val="clear"/>
+          <w:lang w:val="hr-HR"/>
+        </w:rPr>
+        <w:t xml:space="preserve"> Pa, zbog kalcija...</w:t>
+      </w:r>
+    </w:p>
+    <w:p>
+      <w:pPr>
+        <w:pStyle w:val="Normal"/>
+        <w:bidi w:val="0"/>
+        <w:ind w:hanging="900" w:start="900" w:end="0"/>
+        <w:jc w:val="start"/>
+        <w:rPr>
+          <w:b w:val="false"/>
+          <w:bCs w:val="false"/>
+          <w:highlight w:val="none"/>
+          <w:shd w:fill="FFFF00" w:val="clear"/>
+          <w:lang w:val="hr-HR"/>
+        </w:rPr>
+      </w:pPr>
+      <w:r>
+        <w:rPr>
+          <w:b w:val="false"/>
+          <w:bCs w:val="false"/>
+          <w:shd w:fill="FFFF00" w:val="clear"/>
+          <w:lang w:val="hr-HR"/>
+        </w:rPr>
+      </w:r>
+    </w:p>
+    <w:p>
+      <w:pPr>
+        <w:pStyle w:val="Normal"/>
+        <w:bidi w:val="0"/>
+        <w:ind w:hanging="900" w:start="900" w:end="0"/>
+        <w:jc w:val="start"/>
+        <w:rPr>
+          <w:b w:val="false"/>
+          <w:bCs w:val="false"/>
+          <w:highlight w:val="none"/>
+          <w:shd w:fill="FFFF00" w:val="clear"/>
+          <w:lang w:val="hr-HR"/>
+        </w:rPr>
+      </w:pPr>
+      <w:r>
+        <w:rPr>
+          <w:b/>
+          <w:bCs/>
+          <w:shd w:fill="FFFF00" w:val="clear"/>
           <w:lang w:val="hr-HR"/>
         </w:rPr>
         <w:t>Huemer:</w:t>
@@ -1019,9 +1251,10 @@
         <w:rPr>
           <w:b w:val="false"/>
           <w:bCs w:val="false"/>
-          <w:lang w:val="hr-HR"/>
-        </w:rPr>
-        <w:t xml:space="preserve"> A znate li Vi kako to ekstremni nedostatak Vitamina K, koji se, recimo, događa kod novorođenčadi i uzrokuje SIDS, uzrokuje srčane udare?</w:t>
+          <w:shd w:fill="FFFF00" w:val="clear"/>
+          <w:lang w:val="hr-HR"/>
+        </w:rPr>
+        <w:t xml:space="preserve"> Da, je zbog kalcija, ali kako zbog kalcija? Mnogi ljudi to krivo razumiju.</w:t>
       </w:r>
     </w:p>
     <w:p>
@@ -2001,7 +2234,32 @@
           <w:bCs w:val="false"/>
           <w:lang w:val="hr-HR"/>
         </w:rPr>
-        <w:t xml:space="preserve"> Prijatelju, imate li Vi kakvu predodžbu o tome kako se koriste antibiotici u poljoprivredi danas? Recimo, što mislite, koliko posto antibiotika koji se danas koriste koriste se u industriji jaja?</w:t>
+        <w:t xml:space="preserve"> </w:t>
+      </w:r>
+      <w:r>
+        <w:rPr>
+          <w:b w:val="false"/>
+          <w:bCs w:val="false"/>
+          <w:shd w:fill="FFFF00" w:val="clear"/>
+          <w:lang w:val="hr-HR"/>
+        </w:rPr>
+        <w:t>Naravno da trebamo uvijek pokušavati tražiti tehničko rješenje prije negoli tražimo političko. Ali u ovom slučaju tehničko rješenje nije lako dostižno.</w:t>
+      </w:r>
+      <w:r>
+        <w:rPr>
+          <w:b w:val="false"/>
+          <w:bCs w:val="false"/>
+          <w:lang w:val="hr-HR"/>
+        </w:rPr>
+        <w:t xml:space="preserve"> </w:t>
+      </w:r>
+      <w:r>
+        <w:rPr>
+          <w:b w:val="false"/>
+          <w:bCs w:val="false"/>
+          <w:lang w:val="hr-HR"/>
+        </w:rPr>
+        <w:t>Prijatelju, imate li Vi kakvu predodžbu o tome kako se koriste antibiotici u poljoprivredi danas? Recimo, što mislite, koliko posto antibiotika koji se danas koriste koriste se u industriji jaja?</w:t>
       </w:r>
     </w:p>
     <w:p>
@@ -2198,6 +2456,529 @@
           <w:lang w:val="hr-HR"/>
         </w:rPr>
         <w:t xml:space="preserve"> To mnogi kažu, ali postoji li neki matematički model koji uistinu sugerira da većina superbakterija dolazi od mesa? Koliko ja znam, nema. Onda idemo s najboljim matematičkim podacima koje imamo, a to je da većina superbakterija dolazi iz jaja.</w:t>
+      </w:r>
+    </w:p>
+    <w:p>
+      <w:pPr>
+        <w:pStyle w:val="Normal"/>
+        <w:bidi w:val="0"/>
+        <w:ind w:hanging="900" w:start="900" w:end="0"/>
+        <w:jc w:val="start"/>
+        <w:rPr>
+          <w:b w:val="false"/>
+          <w:bCs w:val="false"/>
+          <w:lang w:val="hr-HR"/>
+        </w:rPr>
+      </w:pPr>
+      <w:r>
+        <w:rPr>
+          <w:b w:val="false"/>
+          <w:bCs w:val="false"/>
+          <w:lang w:val="hr-HR"/>
+        </w:rPr>
+      </w:r>
+    </w:p>
+    <w:p>
+      <w:pPr>
+        <w:pStyle w:val="Normal"/>
+        <w:bidi w:val="0"/>
+        <w:ind w:hanging="900" w:start="900" w:end="0"/>
+        <w:jc w:val="start"/>
+        <w:rPr>
+          <w:b w:val="false"/>
+          <w:bCs w:val="false"/>
+          <w:highlight w:val="none"/>
+          <w:shd w:fill="FFFF00" w:val="clear"/>
+          <w:lang w:val="hr-HR"/>
+        </w:rPr>
+      </w:pPr>
+      <w:r>
+        <w:rPr>
+          <w:b/>
+          <w:bCs/>
+          <w:shd w:fill="FFFF00" w:val="clear"/>
+          <w:lang w:val="hr-HR"/>
+        </w:rPr>
+        <w:t>Caplan:</w:t>
+      </w:r>
+      <w:r>
+        <w:rPr>
+          <w:b w:val="false"/>
+          <w:bCs w:val="false"/>
+          <w:shd w:fill="FFFF00" w:val="clear"/>
+          <w:lang w:val="hr-HR"/>
+        </w:rPr>
+        <w:t xml:space="preserve"> Hm, da, kapitalizam dobro rješava problem globalnog zatopljenja. Naše emisije metana dosegle su vrhunac 1980-ih i od tada se smanjuju, sve zahvaljujući tomu što </w:t>
+      </w:r>
+      <w:r>
+        <w:rPr>
+          <w:b w:val="false"/>
+          <w:bCs w:val="false"/>
+          <w:shd w:fill="FFFF00" w:val="clear"/>
+          <w:lang w:val="hr-HR"/>
+        </w:rPr>
+        <w:t>danas ima daleko manje krava koje se hrane travom. Danas se krave uglavnom hrane zrnjam, pa emitiraju znatno manje metana. Ali, izgleda da za superbakterije kapitalizam ne čini čuda.</w:t>
+      </w:r>
+    </w:p>
+    <w:p>
+      <w:pPr>
+        <w:pStyle w:val="Normal"/>
+        <w:bidi w:val="0"/>
+        <w:ind w:hanging="900" w:start="900" w:end="0"/>
+        <w:jc w:val="start"/>
+        <w:rPr>
+          <w:b w:val="false"/>
+          <w:bCs w:val="false"/>
+          <w:highlight w:val="none"/>
+          <w:shd w:fill="FFFF00" w:val="clear"/>
+          <w:lang w:val="hr-HR"/>
+        </w:rPr>
+      </w:pPr>
+      <w:r>
+        <w:rPr>
+          <w:b w:val="false"/>
+          <w:bCs w:val="false"/>
+          <w:shd w:fill="FFFF00" w:val="clear"/>
+          <w:lang w:val="hr-HR"/>
+        </w:rPr>
+      </w:r>
+    </w:p>
+    <w:p>
+      <w:pPr>
+        <w:pStyle w:val="Normal"/>
+        <w:bidi w:val="0"/>
+        <w:ind w:hanging="900" w:start="900" w:end="0"/>
+        <w:jc w:val="start"/>
+        <w:rPr>
+          <w:b w:val="false"/>
+          <w:bCs w:val="false"/>
+          <w:highlight w:val="none"/>
+          <w:shd w:fill="FFFF00" w:val="clear"/>
+          <w:lang w:val="hr-HR"/>
+        </w:rPr>
+      </w:pPr>
+      <w:r>
+        <w:rPr>
+          <w:b/>
+          <w:bCs/>
+          <w:shd w:fill="FFFF00" w:val="clear"/>
+          <w:lang w:val="hr-HR"/>
+        </w:rPr>
+        <w:t xml:space="preserve">Huemer: </w:t>
+      </w:r>
+      <w:r>
+        <w:rPr>
+          <w:b w:val="false"/>
+          <w:bCs w:val="false"/>
+          <w:shd w:fill="FFFF00" w:val="clear"/>
+          <w:lang w:val="hr-HR"/>
+        </w:rPr>
+        <w:t>Ako se naše emisije metana i jesu smanjile, to nije zbog krava. Znate li Vi zašto krave koje se hrane travom emitiraju više metana?</w:t>
+      </w:r>
+    </w:p>
+    <w:p>
+      <w:pPr>
+        <w:pStyle w:val="Normal"/>
+        <w:bidi w:val="0"/>
+        <w:ind w:hanging="900" w:start="900" w:end="0"/>
+        <w:jc w:val="start"/>
+        <w:rPr>
+          <w:b w:val="false"/>
+          <w:bCs w:val="false"/>
+          <w:highlight w:val="none"/>
+          <w:shd w:fill="FFFF00" w:val="clear"/>
+          <w:lang w:val="hr-HR"/>
+        </w:rPr>
+      </w:pPr>
+      <w:r>
+        <w:rPr>
+          <w:b w:val="false"/>
+          <w:bCs w:val="false"/>
+          <w:shd w:fill="FFFF00" w:val="clear"/>
+          <w:lang w:val="hr-HR"/>
+        </w:rPr>
+      </w:r>
+    </w:p>
+    <w:p>
+      <w:pPr>
+        <w:pStyle w:val="Normal"/>
+        <w:bidi w:val="0"/>
+        <w:ind w:hanging="900" w:start="900" w:end="0"/>
+        <w:jc w:val="start"/>
+        <w:rPr>
+          <w:b w:val="false"/>
+          <w:bCs w:val="false"/>
+          <w:highlight w:val="none"/>
+          <w:shd w:fill="FFFF00" w:val="clear"/>
+          <w:lang w:val="hr-HR"/>
+        </w:rPr>
+      </w:pPr>
+      <w:r>
+        <w:rPr>
+          <w:b/>
+          <w:bCs/>
+          <w:shd w:fill="FFFF00" w:val="clear"/>
+          <w:lang w:val="hr-HR"/>
+        </w:rPr>
+        <w:t>Caplan:</w:t>
+      </w:r>
+      <w:r>
+        <w:rPr>
+          <w:b w:val="false"/>
+          <w:bCs w:val="false"/>
+          <w:shd w:fill="FFFF00" w:val="clear"/>
+          <w:lang w:val="hr-HR"/>
+        </w:rPr>
+        <w:t xml:space="preserve"> Pa valjda zato što trava sadrži više vlakana, više celuloze. I ljudi emitiraju više metana kad jedu više celuloze, zar ne?</w:t>
+      </w:r>
+    </w:p>
+    <w:p>
+      <w:pPr>
+        <w:pStyle w:val="Normal"/>
+        <w:bidi w:val="0"/>
+        <w:ind w:hanging="900" w:start="900" w:end="0"/>
+        <w:jc w:val="start"/>
+        <w:rPr>
+          <w:b w:val="false"/>
+          <w:bCs w:val="false"/>
+          <w:highlight w:val="none"/>
+          <w:shd w:fill="FFFF00" w:val="clear"/>
+          <w:lang w:val="hr-HR"/>
+        </w:rPr>
+      </w:pPr>
+      <w:r>
+        <w:rPr>
+          <w:b w:val="false"/>
+          <w:bCs w:val="false"/>
+          <w:shd w:fill="FFFF00" w:val="clear"/>
+          <w:lang w:val="hr-HR"/>
+        </w:rPr>
+      </w:r>
+    </w:p>
+    <w:p>
+      <w:pPr>
+        <w:pStyle w:val="Normal"/>
+        <w:bidi w:val="0"/>
+        <w:ind w:hanging="900" w:start="900" w:end="0"/>
+        <w:jc w:val="start"/>
+        <w:rPr>
+          <w:b w:val="false"/>
+          <w:bCs w:val="false"/>
+          <w:highlight w:val="none"/>
+          <w:shd w:fill="FFFF00" w:val="clear"/>
+          <w:lang w:val="hr-HR"/>
+        </w:rPr>
+      </w:pPr>
+      <w:r>
+        <w:rPr>
+          <w:b/>
+          <w:bCs/>
+          <w:shd w:fill="FFFF00" w:val="clear"/>
+          <w:lang w:val="hr-HR"/>
+        </w:rPr>
+        <w:t>Huemer:</w:t>
+      </w:r>
+      <w:r>
+        <w:rPr>
+          <w:b w:val="false"/>
+          <w:bCs w:val="false"/>
+          <w:shd w:fill="FFFF00" w:val="clear"/>
+          <w:lang w:val="hr-HR"/>
+        </w:rPr>
+        <w:t xml:space="preserve"> Jao, zar Vi o biologiji ne znate ništa osim mitova i laži koje liberali šire po internetu? Ne, nije zbog toga što trava sadrži više celuloze. Krave zapravo emitiraju oko 40% manje metana po kilogramu celuloze nego po kilogramu škroba. Samo što trava sadrži manje proteina nego zrna, pa je omjer konverzije hrane oko dva i pol puta veći za travu nego za zrnja, i zbog toga krave koje se hrane travom emitiraju po cijelom svom životu oko 30% više metana nego krave koje se hrane zrnjem. Vidite, anaerobne arhibakterije u kravinom rumenu rastvaraju i škrob i celulozu u glukozu, i onda upravo ta glukoza, bez obzira na to odakle dolazi, biva pretvorena u nezasićene masne kiseline i metan koji kravi izlazi kroz usta. Ostalo ovisi o brzini kemijskih reakcija, naravno da neke molekule glukoze ipak uđu kravi u krv prije no što ih arhibakterije rastvore na masne kiseline i metan. </w:t>
+      </w:r>
+      <w:r>
+        <w:rPr>
+          <w:b w:val="false"/>
+          <w:bCs w:val="false"/>
+          <w:shd w:fill="FFFF00" w:val="clear"/>
+          <w:lang w:val="hr-HR"/>
+        </w:rPr>
+        <w:t>Danas ima daleko više krava na svijetu nego 1980-ih, i, bez obzira na to čime se hrane, emitiraju zajedno više metana nego krave koje su postojale 1980-ih.</w:t>
+      </w:r>
+    </w:p>
+    <w:p>
+      <w:pPr>
+        <w:pStyle w:val="Normal"/>
+        <w:bidi w:val="0"/>
+        <w:ind w:hanging="900" w:start="900" w:end="0"/>
+        <w:jc w:val="start"/>
+        <w:rPr>
+          <w:b w:val="false"/>
+          <w:bCs w:val="false"/>
+          <w:lang w:val="hr-HR"/>
+        </w:rPr>
+      </w:pPr>
+      <w:r>
+        <w:rPr>
+          <w:b w:val="false"/>
+          <w:bCs w:val="false"/>
+          <w:lang w:val="hr-HR"/>
+        </w:rPr>
+      </w:r>
+    </w:p>
+    <w:p>
+      <w:pPr>
+        <w:pStyle w:val="Normal"/>
+        <w:bidi w:val="0"/>
+        <w:ind w:hanging="900" w:start="900" w:end="0"/>
+        <w:jc w:val="start"/>
+        <w:rPr>
+          <w:b/>
+          <w:bCs/>
+          <w:highlight w:val="none"/>
+          <w:shd w:fill="FFFF00" w:val="clear"/>
+          <w:lang w:val="hr-HR"/>
+        </w:rPr>
+      </w:pPr>
+      <w:r>
+        <w:rPr>
+          <w:b/>
+          <w:bCs/>
+          <w:shd w:fill="FFFF00" w:val="clear"/>
+          <w:lang w:val="hr-HR"/>
+        </w:rPr>
+        <w:t xml:space="preserve">Caplan: </w:t>
+      </w:r>
+      <w:r>
+        <w:rPr>
+          <w:b w:val="false"/>
+          <w:bCs w:val="false"/>
+          <w:shd w:fill="FFFF00" w:val="clear"/>
+          <w:lang w:val="hr-HR"/>
+        </w:rPr>
+        <w:t>Dobro, proučit ću to još malo.</w:t>
+      </w:r>
+    </w:p>
+    <w:p>
+      <w:pPr>
+        <w:pStyle w:val="Normal"/>
+        <w:bidi w:val="0"/>
+        <w:ind w:hanging="900" w:start="900" w:end="0"/>
+        <w:jc w:val="start"/>
+        <w:rPr>
+          <w:b w:val="false"/>
+          <w:bCs w:val="false"/>
+          <w:highlight w:val="none"/>
+          <w:shd w:fill="FFFF00" w:val="clear"/>
+          <w:lang w:val="hr-HR"/>
+        </w:rPr>
+      </w:pPr>
+      <w:r>
+        <w:rPr>
+          <w:b w:val="false"/>
+          <w:bCs w:val="false"/>
+          <w:shd w:fill="FFFF00" w:val="clear"/>
+          <w:lang w:val="hr-HR"/>
+        </w:rPr>
+      </w:r>
+    </w:p>
+    <w:p>
+      <w:pPr>
+        <w:pStyle w:val="Normal"/>
+        <w:bidi w:val="0"/>
+        <w:ind w:hanging="900" w:start="900" w:end="0"/>
+        <w:jc w:val="start"/>
+        <w:rPr>
+          <w:b w:val="false"/>
+          <w:bCs w:val="false"/>
+          <w:highlight w:val="none"/>
+          <w:shd w:fill="FFFF00" w:val="clear"/>
+          <w:lang w:val="hr-HR"/>
+        </w:rPr>
+      </w:pPr>
+      <w:r>
+        <w:rPr>
+          <w:b/>
+          <w:bCs/>
+          <w:shd w:fill="FFFF00" w:val="clear"/>
+          <w:lang w:val="hr-HR"/>
+        </w:rPr>
+        <w:t>Huemer:</w:t>
+      </w:r>
+      <w:r>
+        <w:rPr>
+          <w:b w:val="false"/>
+          <w:bCs w:val="false"/>
+          <w:shd w:fill="FFFF00" w:val="clear"/>
+          <w:lang w:val="hr-HR"/>
+        </w:rPr>
+        <w:t xml:space="preserve"> Gledajte, cijela ta priča o tome kako metan uzrokuje globalno zatopljenje ima relativno malo smisla znanstveno gledajući. Da, metan ima širi spektar u infracrvenom dijelu spektra nego što ima ugljikov dioksid, ali ugljikov dioksid jako apsorbira </w:t>
+      </w:r>
+      <w:r>
+        <w:rPr>
+          <w:b w:val="false"/>
+          <w:bCs w:val="false"/>
+          <w:shd w:fill="FFFF00" w:val="clear"/>
+          <w:lang w:val="hr-HR"/>
+        </w:rPr>
+        <w:t>svjetlost</w:t>
+      </w:r>
+      <w:r>
+        <w:rPr>
+          <w:b w:val="false"/>
+          <w:bCs w:val="false"/>
+          <w:shd w:fill="FFFF00" w:val="clear"/>
+          <w:lang w:val="hr-HR"/>
+        </w:rPr>
+        <w:t xml:space="preserve"> valne duljine od oko </w:t>
+      </w:r>
+      <w:r>
+        <w:rPr>
+          <w:b w:val="false"/>
+          <w:bCs w:val="false"/>
+          <w:shd w:fill="FFFF00" w:val="clear"/>
+          <w:lang w:val="hr-HR"/>
+        </w:rPr>
+        <w:t>4.5 mikrometara, koje voda uopće ne apsorbira. Metan, s druge strane, apsorbira maksimalno valne duljine 2.3 mikrometra i 7.8 mikrometara, a obje te valne duljine voda u atmosferi dobro apsorbira. I prije nego što dođu to metana, voda ih je već apsorbirala. Voda je najjači staklenički plin, i staklenički plinovi koji apsorbiraju iste valne duljine koje voda apsorbira nisu važni. Ima dobar razlog zašto klimatolozi vjeruju da je globalno zatopljenje uglavnom uzrokovano ugljikovim dioksidom. A naše emisije ugljikovog dioksida, naravno, povećavaju se rapidno. Ne pomaže kapitalizam protiv globalnog zatopljenja, to su laži. I ako smanjuje emisije metana, ugljikov dioksid daleko je važniji.</w:t>
+      </w:r>
+    </w:p>
+    <w:p>
+      <w:pPr>
+        <w:pStyle w:val="Normal"/>
+        <w:bidi w:val="0"/>
+        <w:ind w:hanging="900" w:start="900" w:end="0"/>
+        <w:jc w:val="start"/>
+        <w:rPr>
+          <w:b w:val="false"/>
+          <w:bCs w:val="false"/>
+          <w:highlight w:val="none"/>
+          <w:shd w:fill="FFFF00" w:val="clear"/>
+          <w:lang w:val="hr-HR"/>
+        </w:rPr>
+      </w:pPr>
+      <w:r>
+        <w:rPr>
+          <w:b w:val="false"/>
+          <w:bCs w:val="false"/>
+          <w:shd w:fill="FFFF00" w:val="clear"/>
+          <w:lang w:val="hr-HR"/>
+        </w:rPr>
+      </w:r>
+    </w:p>
+    <w:p>
+      <w:pPr>
+        <w:pStyle w:val="Normal"/>
+        <w:bidi w:val="0"/>
+        <w:ind w:hanging="900" w:start="900" w:end="0"/>
+        <w:jc w:val="start"/>
+        <w:rPr>
+          <w:b/>
+          <w:bCs/>
+          <w:highlight w:val="none"/>
+          <w:shd w:fill="FFFF00" w:val="clear"/>
+          <w:lang w:val="hr-HR"/>
+        </w:rPr>
+      </w:pPr>
+      <w:r>
+        <w:rPr>
+          <w:b/>
+          <w:bCs/>
+          <w:shd w:fill="FFFF00" w:val="clear"/>
+          <w:lang w:val="hr-HR"/>
+        </w:rPr>
+        <w:t>Caplan:</w:t>
+      </w:r>
+      <w:r>
+        <w:rPr>
+          <w:b w:val="false"/>
+          <w:bCs w:val="false"/>
+          <w:shd w:fill="FFFF00" w:val="clear"/>
+          <w:lang w:val="hr-HR"/>
+        </w:rPr>
+        <w:t xml:space="preserve"> Nego,</w:t>
+      </w:r>
+      <w:r>
+        <w:rPr>
+          <w:b w:val="false"/>
+          <w:bCs w:val="false"/>
+          <w:shd w:fill="FFFF00" w:val="clear"/>
+          <w:lang w:val="hr-HR"/>
+        </w:rPr>
+        <w:t xml:space="preserve"> to što Vi kažete da je vlada, kad pokušava rješiti društvene probleme, uglavnom u poziciji medijevalnih liječnika, jer ima neke predznanstvene ideje kako društvo funkcionira jer društvene znanosti nisu razvijene, zar se to ne odnosi </w:t>
+      </w:r>
+      <w:r>
+        <w:rPr>
+          <w:b w:val="false"/>
+          <w:bCs w:val="false"/>
+          <w:shd w:fill="FFFF00" w:val="clear"/>
+          <w:lang w:val="hr-HR"/>
+        </w:rPr>
+        <w:t>i na prevenciju superbakterija</w:t>
+      </w:r>
+      <w:r>
+        <w:rPr>
+          <w:b w:val="false"/>
+          <w:bCs w:val="false"/>
+          <w:shd w:fill="FFFF00" w:val="clear"/>
+          <w:lang w:val="hr-HR"/>
+        </w:rPr>
+        <w:t>?</w:t>
+      </w:r>
+    </w:p>
+    <w:p>
+      <w:pPr>
+        <w:pStyle w:val="Normal"/>
+        <w:bidi w:val="0"/>
+        <w:ind w:hanging="900" w:start="900" w:end="0"/>
+        <w:jc w:val="start"/>
+        <w:rPr>
+          <w:b w:val="false"/>
+          <w:bCs w:val="false"/>
+          <w:highlight w:val="none"/>
+          <w:shd w:fill="FFFF00" w:val="clear"/>
+          <w:lang w:val="hr-HR"/>
+        </w:rPr>
+      </w:pPr>
+      <w:r>
+        <w:rPr>
+          <w:b w:val="false"/>
+          <w:bCs w:val="false"/>
+          <w:shd w:fill="FFFF00" w:val="clear"/>
+          <w:lang w:val="hr-HR"/>
+        </w:rPr>
+      </w:r>
+    </w:p>
+    <w:p>
+      <w:pPr>
+        <w:pStyle w:val="Normal"/>
+        <w:bidi w:val="0"/>
+        <w:ind w:hanging="900" w:start="900" w:end="0"/>
+        <w:jc w:val="start"/>
+        <w:rPr>
+          <w:b w:val="false"/>
+          <w:bCs w:val="false"/>
+          <w:highlight w:val="none"/>
+          <w:shd w:fill="FFFF00" w:val="clear"/>
+          <w:lang w:val="hr-HR"/>
+        </w:rPr>
+      </w:pPr>
+      <w:r>
+        <w:rPr>
+          <w:b/>
+          <w:bCs/>
+          <w:shd w:fill="FFFF00" w:val="clear"/>
+          <w:lang w:val="hr-HR"/>
+        </w:rPr>
+        <w:t>Huemer:</w:t>
+      </w:r>
+      <w:r>
+        <w:rPr>
+          <w:b w:val="false"/>
+          <w:bCs w:val="false"/>
+          <w:shd w:fill="FFFF00" w:val="clear"/>
+          <w:lang w:val="hr-HR"/>
+        </w:rPr>
+        <w:t xml:space="preserve"> To se možda odnosi na lockdowne i slične politike, kada vlada pokušava </w:t>
+      </w:r>
+      <w:r>
+        <w:rPr>
+          <w:b w:val="false"/>
+          <w:bCs w:val="false"/>
+          <w:shd w:fill="FFFF00" w:val="clear"/>
+          <w:lang w:val="hr-HR"/>
+        </w:rPr>
+        <w:t>pogoditi kako treba masivno izmijeniti društvo koje ne razumije u detalje da bismo usporili pandemiju. Ne vidim kako smo to u poziciji medijevalnih liječnika kada pokušavamo riješiti probleme koje relativno dobro razumijemo, kao što je problem superbakterija. Kakve to sile iz društvenih znanosti ovdje mogu imati utjecaj?</w:t>
       </w:r>
     </w:p>
     <w:p>
@@ -2230,19 +3011,17 @@
         <w:ind w:hanging="0" w:start="0" w:end="0"/>
         <w:jc w:val="both"/>
         <w:rPr>
+          <w:highlight w:val="none"/>
+          <w:shd w:fill="FFFF00" w:val="clear"/>
+        </w:rPr>
+      </w:pPr>
+      <w:r>
+        <w:rPr>
           <w:b w:val="false"/>
           <w:bCs w:val="false"/>
           <w:i/>
           <w:iCs/>
-          <w:lang w:val="hr-HR"/>
-        </w:rPr>
-      </w:pPr>
-      <w:r>
-        <w:rPr>
-          <w:b w:val="false"/>
-          <w:bCs w:val="false"/>
-          <w:i/>
-          <w:iCs/>
+          <w:shd w:fill="FFFF00" w:val="clear"/>
           <w:lang w:val="hr-HR"/>
         </w:rPr>
         <w:t>(Opaska autora: Ubacio bih ovdje onu retoriku da bi superbakterije nestale da se samo ukinu poljoprivredni poticaji industriji jaja, ali mislim da je Caplan dovoljno razuman da tako nešto ne kaže.)</w:t>
@@ -2343,7 +3122,16 @@
           <w:bCs w:val="false"/>
           <w:lang w:val="hr-HR"/>
         </w:rPr>
-        <w:t xml:space="preserve"> Zar ste Vi pod dojmom da malene životinje u Kini dobivaju veterinarsku njegu? Zvuči mi to veoma zapetljano. Uostalom, što ćemo s ptičjom gripom uzrokovanom svinjama?</w:t>
+        <w:t xml:space="preserve"> Zar ste Vi pod dojmom da malene životinje u Kini dobivaju veterinarsku njegu? Zvuči mi to veoma zapetljano. Uostalom, što ćemo s ptičjom gripom uzrokovanom svinjama? </w:t>
+      </w:r>
+      <w:r>
+        <w:rPr>
+          <w:b w:val="false"/>
+          <w:bCs w:val="false"/>
+          <w:shd w:fill="FFFF00" w:val="clear"/>
+          <w:lang w:val="hr-HR"/>
+        </w:rPr>
+        <w:t>Mislim, za ptičju gripu je daleko važnije da jedinki svinja ima manje nego da one dobivaju veterinarsku njegu, zar ne?</w:t>
       </w:r>
     </w:p>
     <w:p>
@@ -2442,6 +3230,106 @@
           <w:lang w:val="hr-HR"/>
         </w:rPr>
         <w:t xml:space="preserve"> Doviđenja! Nisam ni mislio da ću Vas uvjeriti, ali nadam se da ćete razmišljati i dalje o ovim stvarima, i možda ćemo se kasnije složiti.</w:t>
+      </w:r>
+    </w:p>
+    <w:p>
+      <w:pPr>
+        <w:pStyle w:val="Normal"/>
+        <w:bidi w:val="0"/>
+        <w:ind w:hanging="900" w:start="900" w:end="0"/>
+        <w:jc w:val="start"/>
+        <w:rPr>
+          <w:b w:val="false"/>
+          <w:bCs w:val="false"/>
+          <w:lang w:val="hr-HR"/>
+        </w:rPr>
+      </w:pPr>
+      <w:r>
+        <w:rPr>
+          <w:b w:val="false"/>
+          <w:bCs w:val="false"/>
+          <w:lang w:val="hr-HR"/>
+        </w:rPr>
+      </w:r>
+    </w:p>
+    <w:p>
+      <w:pPr>
+        <w:pStyle w:val="Normal"/>
+        <w:bidi w:val="0"/>
+        <w:ind w:hanging="900" w:start="900" w:end="0"/>
+        <w:jc w:val="start"/>
+        <w:rPr>
+          <w:b w:val="false"/>
+          <w:bCs w:val="false"/>
+          <w:highlight w:val="none"/>
+          <w:shd w:fill="FFFF00" w:val="clear"/>
+          <w:lang w:val="hr-HR"/>
+        </w:rPr>
+      </w:pPr>
+      <w:r>
+        <w:rPr>
+          <w:b w:val="false"/>
+          <w:bCs w:val="false"/>
+          <w:shd w:fill="FFFF00" w:val="clear"/>
+          <w:lang w:val="hr-HR"/>
+        </w:rPr>
+        <w:t>(Caplan odlazi.)</w:t>
+      </w:r>
+    </w:p>
+    <w:p>
+      <w:pPr>
+        <w:pStyle w:val="Normal"/>
+        <w:bidi w:val="0"/>
+        <w:ind w:hanging="900" w:start="900" w:end="0"/>
+        <w:jc w:val="start"/>
+        <w:rPr>
+          <w:b w:val="false"/>
+          <w:bCs w:val="false"/>
+          <w:highlight w:val="none"/>
+          <w:shd w:fill="FFFF00" w:val="clear"/>
+          <w:lang w:val="hr-HR"/>
+        </w:rPr>
+      </w:pPr>
+      <w:r>
+        <w:rPr>
+          <w:b w:val="false"/>
+          <w:bCs w:val="false"/>
+          <w:shd w:fill="FFFF00" w:val="clear"/>
+          <w:lang w:val="hr-HR"/>
+        </w:rPr>
+      </w:r>
+    </w:p>
+    <w:p>
+      <w:pPr>
+        <w:pStyle w:val="Normal"/>
+        <w:bidi w:val="0"/>
+        <w:ind w:hanging="900" w:start="900" w:end="0"/>
+        <w:jc w:val="start"/>
+        <w:rPr>
+          <w:b w:val="false"/>
+          <w:bCs w:val="false"/>
+          <w:highlight w:val="none"/>
+          <w:shd w:fill="FFFF00" w:val="clear"/>
+          <w:lang w:val="hr-HR"/>
+        </w:rPr>
+      </w:pPr>
+      <w:r>
+        <w:rPr>
+          <w:b/>
+          <w:bCs/>
+          <w:shd w:fill="FFFF00" w:val="clear"/>
+          <w:lang w:val="hr-HR"/>
+        </w:rPr>
+        <w:t>Huemer:</w:t>
+      </w:r>
+      <w:r>
+        <w:rPr>
+          <w:b w:val="false"/>
+          <w:bCs w:val="false"/>
+          <w:shd w:fill="FFFF00" w:val="clear"/>
+          <w:lang w:val="hr-HR"/>
+        </w:rPr>
+        <w:t xml:space="preserve"> (Sam sa sobom priča.) Što to uopće znači biti autoritaran kad govorimo o prevenciji pandemije superbakterije? Pandemija superbakterije dat će vladi daleko više moći nego bilo koji rat.</w:t>
       </w:r>
     </w:p>
     <w:sectPr>

</xml_diff>

<commit_message>
Added some information about the bat immune system
</commit_message>
<xml_diff>
--- a/zabranjivanje_mesa.docx
+++ b/zabranjivanje_mesa.docx
@@ -648,25 +648,7 @@
           <w:shd w:fill="FFFF00" w:val="clear"/>
           <w:lang w:val="hr-HR"/>
         </w:rPr>
-        <w:t xml:space="preserve">Pa, kao prvo, intenzivan uzgoj životinja, ako išta, još je više usporediv s genocidom jer intenzivan uzgoj životinja ubija daleko više životinja nego što je nužno. Imate li Vi ikakve ideje o tome koliko glodavaca biva ubijeno u proizvodnji zrnja za stočnu hranu? Drugim riječima, nizašto, jer stvarno možemo bez toga? </w:t>
-      </w:r>
-      <w:r>
-        <w:rPr>
-          <w:b w:val="false"/>
-          <w:bCs w:val="false"/>
-          <w:shd w:fill="FFFF00" w:val="clear"/>
-          <w:lang w:val="hr-HR"/>
-        </w:rPr>
-        <w:t>Gotovo svi glodavci koje ubijamo ubijeni su radi stočne hrane.</w:t>
-      </w:r>
-      <w:r>
-        <w:rPr>
-          <w:b w:val="false"/>
-          <w:bCs w:val="false"/>
-          <w:shd w:fill="FFFF00" w:val="clear"/>
-          <w:lang w:val="hr-HR"/>
-        </w:rPr>
-        <w:t xml:space="preserve"> Kao drugo</w:t>
+        <w:t>Pa, kao prvo, intenzivan uzgoj životinja, ako išta, još je više usporediv s genocidom jer intenzivan uzgoj životinja ubija daleko više životinja nego što je nužno. Imate li Vi ikakve ideje o tome koliko glodavaca biva ubijeno u proizvodnji zrnja za stočnu hranu? Drugim riječima, nizašto, jer stvarno možemo bez toga? Gotovo svi glodavci koje ubijamo ubijeni su radi stočne hrane. Kao drugo</w:t>
       </w:r>
       <w:r>
         <w:rPr>
@@ -933,23 +915,7 @@
           <w:bCs w:val="false"/>
           <w:lang w:val="hr-HR"/>
         </w:rPr>
-        <w:t xml:space="preserve">A </w:t>
-      </w:r>
-      <w:r>
-        <w:rPr>
-          <w:b w:val="false"/>
-          <w:bCs w:val="false"/>
-          <w:lang w:val="hr-HR"/>
-        </w:rPr>
-        <w:t>što se tiče tih nutricionalnih deficijencija,</w:t>
-      </w:r>
-      <w:r>
-        <w:rPr>
-          <w:b w:val="false"/>
-          <w:bCs w:val="false"/>
-          <w:lang w:val="hr-HR"/>
-        </w:rPr>
-        <w:t xml:space="preserve"> kako onda gotovo sve studije pokazuju da vegani i vegetarijanci imaju manji rizik od srčanog udara, a ne veći?</w:t>
+        <w:t>A što se tiče tih nutricionalnih deficijencija, kako onda gotovo sve studije pokazuju da vegani i vegetarijanci imaju manji rizik od srčanog udara, a ne veći?</w:t>
       </w:r>
     </w:p>
     <w:p>
@@ -2251,15 +2217,7 @@
           <w:bCs w:val="false"/>
           <w:lang w:val="hr-HR"/>
         </w:rPr>
-        <w:t xml:space="preserve"> </w:t>
-      </w:r>
-      <w:r>
-        <w:rPr>
-          <w:b w:val="false"/>
-          <w:bCs w:val="false"/>
-          <w:lang w:val="hr-HR"/>
-        </w:rPr>
-        <w:t>Prijatelju, imate li Vi kakvu predodžbu o tome kako se koriste antibiotici u poljoprivredi danas? Recimo, što mislite, koliko posto antibiotika koji se danas koriste koriste se u industriji jaja?</w:t>
+        <w:t xml:space="preserve"> Prijatelju, imate li Vi kakvu predodžbu o tome kako se koriste antibiotici u poljoprivredi danas? Recimo, što mislite, koliko posto antibiotika koji se danas koriste koriste se u industriji jaja?</w:t>
       </w:r>
     </w:p>
     <w:p>
@@ -2455,7 +2413,33 @@
           <w:bCs w:val="false"/>
           <w:lang w:val="hr-HR"/>
         </w:rPr>
-        <w:t xml:space="preserve"> To mnogi kažu, ali postoji li neki matematički model koji uistinu sugerira da većina superbakterija dolazi od mesa? Koliko ja znam, nema. Onda idemo s najboljim matematičkim podacima koje imamo, a to je da većina superbakterija dolazi iz jaja.</w:t>
+        <w:t xml:space="preserve"> To mnogi kažu, ali postoji li neki matematički model koji uistinu sugerira da većina superbakterija dolazi od mesa? Koliko ja znam,</w:t>
+      </w:r>
+      <w:r>
+        <w:rPr>
+          <w:b w:val="false"/>
+          <w:bCs w:val="false"/>
+          <w:shd w:fill="FFFF00" w:val="clear"/>
+          <w:lang w:val="hr-HR"/>
+        </w:rPr>
+        <w:t xml:space="preserve"> nema </w:t>
+      </w:r>
+      <w:r>
+        <w:rPr>
+          <w:b w:val="false"/>
+          <w:bCs w:val="false"/>
+          <w:shd w:fill="FFFF00" w:val="clear"/>
+          <w:lang w:val="hr-HR"/>
+        </w:rPr>
+        <w:t>takvog matematičkog modela</w:t>
+      </w:r>
+      <w:r>
+        <w:rPr>
+          <w:b w:val="false"/>
+          <w:bCs w:val="false"/>
+          <w:lang w:val="hr-HR"/>
+        </w:rPr>
+        <w:t>. Onda idemo s najboljim matematičkim podacima koje imamo, a to je da većina superbakterija dolazi iz jaja.</w:t>
       </w:r>
     </w:p>
     <w:p>
@@ -2508,16 +2492,7 @@
           <w:shd w:fill="FFFF00" w:val="clear"/>
           <w:lang w:val="hr-HR"/>
         </w:rPr>
-        <w:t xml:space="preserve"> Hm, da, kapitalizam dobro rješava problem globalnog zatopljenja. Naše emisije metana dosegle su vrhunac 1980-ih i od tada se smanjuju, sve zahvaljujući tomu što </w:t>
-      </w:r>
-      <w:r>
-        <w:rPr>
-          <w:b w:val="false"/>
-          <w:bCs w:val="false"/>
-          <w:shd w:fill="FFFF00" w:val="clear"/>
-          <w:lang w:val="hr-HR"/>
-        </w:rPr>
-        <w:t>danas ima daleko manje krava koje se hrane travom. Danas se krave uglavnom hrane zrnjam, pa emitiraju znatno manje metana. Ali, izgleda da za superbakterije kapitalizam ne čini čuda.</w:t>
+        <w:t xml:space="preserve"> Hm, da, kapitalizam dobro rješava problem globalnog zatopljenja. Naše emisije metana dosegle su vrhunac 1980-ih i od tada se smanjuju, sve zahvaljujući tomu što danas ima daleko manje krava koje se hrane travom. Danas se krave uglavnom hrane zrnjam, pa emitiraju znatno manje metana. Ali, izgleda da za superbakterije kapitalizam ne čini čuda.</w:t>
       </w:r>
     </w:p>
     <w:p>
@@ -2685,16 +2660,7 @@
           <w:shd w:fill="FFFF00" w:val="clear"/>
           <w:lang w:val="hr-HR"/>
         </w:rPr>
-        <w:t xml:space="preserve"> Jao, zar Vi o biologiji ne znate ništa osim mitova i laži koje liberali šire po internetu? Ne, nije zbog toga što trava sadrži više celuloze. Krave zapravo emitiraju oko 40% manje metana po kilogramu celuloze nego po kilogramu škroba. Samo što trava sadrži manje proteina nego zrna, pa je omjer konverzije hrane oko dva i pol puta veći za travu nego za zrnja, i zbog toga krave koje se hrane travom emitiraju po cijelom svom životu oko 30% više metana nego krave koje se hrane zrnjem. Vidite, anaerobne arhibakterije u kravinom rumenu rastvaraju i škrob i celulozu u glukozu, i onda upravo ta glukoza, bez obzira na to odakle dolazi, biva pretvorena u nezasićene masne kiseline i metan koji kravi izlazi kroz usta. Ostalo ovisi o brzini kemijskih reakcija, naravno da neke molekule glukoze ipak uđu kravi u krv prije no što ih arhibakterije rastvore na masne kiseline i metan. </w:t>
-      </w:r>
-      <w:r>
-        <w:rPr>
-          <w:b w:val="false"/>
-          <w:bCs w:val="false"/>
-          <w:shd w:fill="FFFF00" w:val="clear"/>
-          <w:lang w:val="hr-HR"/>
-        </w:rPr>
-        <w:t>Danas ima daleko više krava na svijetu nego 1980-ih, i, bez obzira na to čime se hrane, emitiraju zajedno više metana nego krave koje su postojale 1980-ih.</w:t>
+        <w:t xml:space="preserve"> Jao, zar Vi o biologiji ne znate ništa osim mitova i laži koje liberali šire po internetu? Ne, nije zbog toga što trava sadrži više celuloze. Krave zapravo emitiraju oko 40% manje metana po kilogramu celuloze nego po kilogramu škroba. Samo što trava sadrži manje proteina nego zrna, pa je omjer konverzije hrane oko dva i pol puta veći za travu nego za zrnja, i zbog toga krave koje se hrane travom emitiraju po cijelom svom životu oko 30% više metana nego krave koje se hrane zrnjem. Vidite, anaerobne arhibakterije u kravinom rumenu rastvaraju i škrob i celulozu u glukozu, i onda upravo ta glukoza, bez obzira na to odakle dolazi, biva pretvorena u nezasićene masne kiseline i metan koji kravi izlazi kroz usta. Ostalo ovisi o brzini kemijskih reakcija, naravno da neke molekule glukoze ipak uđu kravi u krv prije no što ih arhibakterije rastvore na masne kiseline i metan. Danas ima daleko više krava na svijetu nego 1980-ih, i, bez obzira na to čime se hrane, emitiraju zajedno više metana nego krave koje su postojale 1980-ih.</w:t>
       </w:r>
     </w:p>
     <w:p>
@@ -2803,34 +2769,7 @@
           <w:shd w:fill="FFFF00" w:val="clear"/>
           <w:lang w:val="hr-HR"/>
         </w:rPr>
-        <w:t xml:space="preserve"> Gledajte, cijela ta priča o tome kako metan uzrokuje globalno zatopljenje ima relativno malo smisla znanstveno gledajući. Da, metan ima širi spektar u infracrvenom dijelu spektra nego što ima ugljikov dioksid, ali ugljikov dioksid jako apsorbira </w:t>
-      </w:r>
-      <w:r>
-        <w:rPr>
-          <w:b w:val="false"/>
-          <w:bCs w:val="false"/>
-          <w:shd w:fill="FFFF00" w:val="clear"/>
-          <w:lang w:val="hr-HR"/>
-        </w:rPr>
-        <w:t>svjetlost</w:t>
-      </w:r>
-      <w:r>
-        <w:rPr>
-          <w:b w:val="false"/>
-          <w:bCs w:val="false"/>
-          <w:shd w:fill="FFFF00" w:val="clear"/>
-          <w:lang w:val="hr-HR"/>
-        </w:rPr>
-        <w:t xml:space="preserve"> valne duljine od oko </w:t>
-      </w:r>
-      <w:r>
-        <w:rPr>
-          <w:b w:val="false"/>
-          <w:bCs w:val="false"/>
-          <w:shd w:fill="FFFF00" w:val="clear"/>
-          <w:lang w:val="hr-HR"/>
-        </w:rPr>
-        <w:t>4.5 mikrometara, koje voda uopće ne apsorbira. Metan, s druge strane, apsorbira maksimalno valne duljine 2.3 mikrometra i 7.8 mikrometara, a obje te valne duljine voda u atmosferi dobro apsorbira. I prije nego što dođu to metana, voda ih je već apsorbirala. Voda je najjači staklenički plin, i staklenički plinovi koji apsorbiraju iste valne duljine koje voda apsorbira nisu važni. Ima dobar razlog zašto klimatolozi vjeruju da je globalno zatopljenje uglavnom uzrokovano ugljikovim dioksidom. A naše emisije ugljikovog dioksida, naravno, povećavaju se rapidno. Ne pomaže kapitalizam protiv globalnog zatopljenja, to su laži. I ako smanjuje emisije metana, ugljikov dioksid daleko je važniji.</w:t>
+        <w:t xml:space="preserve"> Gledajte, cijela ta priča o tome kako metan uzrokuje globalno zatopljenje ima relativno malo smisla znanstveno gledajući. Da, metan ima širi spektar u infracrvenom dijelu spektra nego što ima ugljikov dioksid, ali ugljikov dioksid jako apsorbira svjetlost valne duljine od oko 4.5 mikrometara, koje voda uopće ne apsorbira. Metan, s druge strane, apsorbira maksimalno valne duljine 2.3 mikrometra i 7.8 mikrometara, a obje te valne duljine voda u atmosferi dobro apsorbira. I prije nego što dođu to metana, voda ih je već apsorbirala. Voda je najjači staklenički plin, i staklenički plinovi koji apsorbiraju iste valne duljine koje voda apsorbira nisu važni. Ima dobar razlog zašto klimatolozi vjeruju da je globalno zatopljenje uglavnom uzrokovano ugljikovim dioksidom. A naše emisije ugljikovog dioksida, naravno, povećavaju se rapidno. Ne pomaže kapitalizam protiv globalnog zatopljenja, to su laži. I ako smanjuje emisije metana, ugljikov dioksid daleko je važniji.</w:t>
       </w:r>
     </w:p>
     <w:p>
@@ -2886,34 +2825,7 @@
           <w:shd w:fill="FFFF00" w:val="clear"/>
           <w:lang w:val="hr-HR"/>
         </w:rPr>
-        <w:t xml:space="preserve"> Nego,</w:t>
-      </w:r>
-      <w:r>
-        <w:rPr>
-          <w:b w:val="false"/>
-          <w:bCs w:val="false"/>
-          <w:shd w:fill="FFFF00" w:val="clear"/>
-          <w:lang w:val="hr-HR"/>
-        </w:rPr>
-        <w:t xml:space="preserve"> to što Vi kažete da je vlada, kad pokušava rješiti društvene probleme, uglavnom u poziciji medijevalnih liječnika, jer ima neke predznanstvene ideje kako društvo funkcionira jer društvene znanosti nisu razvijene, zar se to ne odnosi </w:t>
-      </w:r>
-      <w:r>
-        <w:rPr>
-          <w:b w:val="false"/>
-          <w:bCs w:val="false"/>
-          <w:shd w:fill="FFFF00" w:val="clear"/>
-          <w:lang w:val="hr-HR"/>
-        </w:rPr>
-        <w:t>i na prevenciju superbakterija</w:t>
-      </w:r>
-      <w:r>
-        <w:rPr>
-          <w:b w:val="false"/>
-          <w:bCs w:val="false"/>
-          <w:shd w:fill="FFFF00" w:val="clear"/>
-          <w:lang w:val="hr-HR"/>
-        </w:rPr>
-        <w:t>?</w:t>
+        <w:t xml:space="preserve"> Nego, to što Vi kažete da je vlada, kad pokušava rješiti društvene probleme, uglavnom u poziciji medijevalnih liječnika, jer ima neke predznanstvene ideje kako društvo funkcionira jer društvene znanosti nisu razvijene, zar se to ne odnosi i na prevenciju superbakterija?</w:t>
       </w:r>
     </w:p>
     <w:p>
@@ -2969,16 +2881,7 @@
           <w:shd w:fill="FFFF00" w:val="clear"/>
           <w:lang w:val="hr-HR"/>
         </w:rPr>
-        <w:t xml:space="preserve"> To se možda odnosi na lockdowne i slične politike, kada vlada pokušava </w:t>
-      </w:r>
-      <w:r>
-        <w:rPr>
-          <w:b w:val="false"/>
-          <w:bCs w:val="false"/>
-          <w:shd w:fill="FFFF00" w:val="clear"/>
-          <w:lang w:val="hr-HR"/>
-        </w:rPr>
-        <w:t>pogoditi kako treba masivno izmijeniti društvo koje ne razumije u detalje da bismo usporili pandemiju. Ne vidim kako smo to u poziciji medijevalnih liječnika kada pokušavamo riješiti probleme koje relativno dobro razumijemo, kao što je problem superbakterija. Kakve to sile iz društvenih znanosti ovdje mogu imati utjecaj?</w:t>
+        <w:t xml:space="preserve"> To se možda odnosi na lockdowne i slične politike, kada vlada pokušava pogoditi kako treba masivno izmijeniti društvo koje ne razumije u detalje da bismo usporili pandemiju. Ne vidim kako smo to u poziciji medijevalnih liječnika kada pokušavamo riješiti probleme koje relativno dobro razumijemo, kao što je problem superbakterija. Kakve to sile iz društvenih znanosti ovdje mogu imati utjecaj?</w:t>
       </w:r>
     </w:p>
     <w:p>
@@ -3122,7 +3025,229 @@
           <w:bCs w:val="false"/>
           <w:lang w:val="hr-HR"/>
         </w:rPr>
-        <w:t xml:space="preserve"> Zar ste Vi pod dojmom da malene životinje u Kini dobivaju veterinarsku njegu? Zvuči mi to veoma zapetljano. Uostalom, što ćemo s ptičjom gripom uzrokovanom svinjama? </w:t>
+        <w:t xml:space="preserve"> Zar ste Vi pod dojmom da malene životinje u Kini dobivaju veterinarsku njegu? Zvuči mi to veoma zapetljano.</w:t>
+      </w:r>
+    </w:p>
+    <w:p>
+      <w:pPr>
+        <w:pStyle w:val="Normal"/>
+        <w:bidi w:val="0"/>
+        <w:ind w:hanging="900" w:start="900" w:end="0"/>
+        <w:jc w:val="start"/>
+        <w:rPr>
+          <w:b/>
+          <w:bCs/>
+          <w:lang w:val="hr-HR"/>
+        </w:rPr>
+      </w:pPr>
+      <w:r>
+        <w:rPr>
+          <w:b/>
+          <w:bCs/>
+          <w:lang w:val="hr-HR"/>
+        </w:rPr>
+      </w:r>
+    </w:p>
+    <w:p>
+      <w:pPr>
+        <w:pStyle w:val="Normal"/>
+        <w:bidi w:val="0"/>
+        <w:ind w:hanging="900" w:start="900" w:end="0"/>
+        <w:jc w:val="start"/>
+        <w:rPr>
+          <w:b/>
+          <w:bCs/>
+          <w:highlight w:val="none"/>
+          <w:shd w:fill="FFFF00" w:val="clear"/>
+          <w:lang w:val="hr-HR"/>
+        </w:rPr>
+      </w:pPr>
+      <w:r>
+        <w:rPr>
+          <w:b/>
+          <w:bCs/>
+          <w:shd w:fill="FFFF00" w:val="clear"/>
+          <w:lang w:val="hr-HR"/>
+        </w:rPr>
+        <w:t xml:space="preserve">Caplan: </w:t>
+      </w:r>
+      <w:r>
+        <w:rPr>
+          <w:b w:val="false"/>
+          <w:bCs w:val="false"/>
+          <w:shd w:fill="FFFF00" w:val="clear"/>
+          <w:lang w:val="hr-HR"/>
+        </w:rPr>
+        <w:t>Pa kako onda pandemije gotovo uvijek dolaze od ilegalnog mesa, kao što su šišmiši?</w:t>
+      </w:r>
+    </w:p>
+    <w:p>
+      <w:pPr>
+        <w:pStyle w:val="Normal"/>
+        <w:bidi w:val="0"/>
+        <w:ind w:hanging="900" w:start="900" w:end="0"/>
+        <w:jc w:val="start"/>
+        <w:rPr>
+          <w:b w:val="false"/>
+          <w:bCs w:val="false"/>
+          <w:highlight w:val="none"/>
+          <w:shd w:fill="FFFF00" w:val="clear"/>
+          <w:lang w:val="hr-HR"/>
+        </w:rPr>
+      </w:pPr>
+      <w:r>
+        <w:rPr>
+          <w:b w:val="false"/>
+          <w:bCs w:val="false"/>
+          <w:shd w:fill="FFFF00" w:val="clear"/>
+          <w:lang w:val="hr-HR"/>
+        </w:rPr>
+      </w:r>
+    </w:p>
+    <w:p>
+      <w:pPr>
+        <w:pStyle w:val="Normal"/>
+        <w:bidi w:val="0"/>
+        <w:ind w:hanging="900" w:start="900" w:end="0"/>
+        <w:jc w:val="start"/>
+        <w:rPr>
+          <w:b w:val="false"/>
+          <w:bCs w:val="false"/>
+          <w:highlight w:val="none"/>
+          <w:shd w:fill="FFFF00" w:val="clear"/>
+          <w:lang w:val="hr-HR"/>
+        </w:rPr>
+      </w:pPr>
+      <w:r>
+        <w:rPr>
+          <w:b/>
+          <w:bCs/>
+          <w:shd w:fill="FFFF00" w:val="clear"/>
+          <w:lang w:val="hr-HR"/>
+        </w:rPr>
+        <w:t>Huemer:</w:t>
+      </w:r>
+      <w:r>
+        <w:rPr>
+          <w:b w:val="false"/>
+          <w:bCs w:val="false"/>
+          <w:shd w:fill="FFFF00" w:val="clear"/>
+          <w:lang w:val="hr-HR"/>
+        </w:rPr>
+        <w:t xml:space="preserve"> Pa, kao prvo, šišmiši su aktivni noću, kad nema sunca koje ubija viruse. Životinje koje su aktivne noću općenito su jači izvor virusnih pandemija nego životinje aktivne danju. Kao drugo, šišmiši imaju posve drugačiji imunosni sustav nego ljudi ili većina drugih sisavaca. Znate kako za neke viruse, kao što je onaj virus što uzrokuje vodene kozice u dječjoj dobi i šinglije u staroj dobi, naš imunosni sustav ne uklanja taj virus iz organizma, nego ga učini dormijentnim u neuronima, i on se onda može opet aktivirati kad imunosni sustav oslabi? E, pa, vidite, šišmišji imunosni sustav to radi za većinu virusa koji napadaju šišmiše, uključujući i koronaviruse. Nije ni čudo onda da su koronavirusi koji na ostalim sisavcima ne bi preživjeli zbog prevelike fatalnosti na šišmišima od te prirodne selekcije zaštićeni drugačijim imunosnim sustavom, i da su zato šišmiši jak izvor zoonoza. Da je legalno jesti šišmiše, virusne pandemije gotovo sigurno bile bi češće. Ovo nije kao problem abortusa ili zlouporabe droge gdje činjenje nečega ilegalnim ne čini da se to prestane događati, nego čini da se događa još gori oblik toga.</w:t>
+      </w:r>
+    </w:p>
+    <w:p>
+      <w:pPr>
+        <w:pStyle w:val="Normal"/>
+        <w:bidi w:val="0"/>
+        <w:ind w:hanging="900" w:start="900" w:end="0"/>
+        <w:jc w:val="start"/>
+        <w:rPr>
+          <w:b w:val="false"/>
+          <w:bCs w:val="false"/>
+          <w:highlight w:val="none"/>
+          <w:shd w:fill="FFFF00" w:val="clear"/>
+          <w:lang w:val="hr-HR"/>
+        </w:rPr>
+      </w:pPr>
+      <w:r>
+        <w:rPr>
+          <w:b w:val="false"/>
+          <w:bCs w:val="false"/>
+          <w:shd w:fill="FFFF00" w:val="clear"/>
+          <w:lang w:val="hr-HR"/>
+        </w:rPr>
+      </w:r>
+    </w:p>
+    <w:p>
+      <w:pPr>
+        <w:pStyle w:val="Normal"/>
+        <w:bidi w:val="0"/>
+        <w:ind w:hanging="900" w:start="900" w:end="0"/>
+        <w:jc w:val="start"/>
+        <w:rPr>
+          <w:b w:val="false"/>
+          <w:bCs w:val="false"/>
+          <w:highlight w:val="none"/>
+          <w:shd w:fill="FFFF00" w:val="clear"/>
+          <w:lang w:val="hr-HR"/>
+        </w:rPr>
+      </w:pPr>
+      <w:r>
+        <w:rPr>
+          <w:b/>
+          <w:bCs/>
+          <w:shd w:fill="FFFF00" w:val="clear"/>
+          <w:lang w:val="hr-HR"/>
+        </w:rPr>
+        <w:t>Caplan:</w:t>
+      </w:r>
+      <w:r>
+        <w:rPr>
+          <w:b w:val="false"/>
+          <w:bCs w:val="false"/>
+          <w:shd w:fill="FFFF00" w:val="clear"/>
+          <w:lang w:val="hr-HR"/>
+        </w:rPr>
+        <w:t xml:space="preserve"> Dobro, proučit ću to još malo.</w:t>
+      </w:r>
+    </w:p>
+    <w:p>
+      <w:pPr>
+        <w:pStyle w:val="Normal"/>
+        <w:bidi w:val="0"/>
+        <w:ind w:hanging="900" w:start="900" w:end="0"/>
+        <w:jc w:val="start"/>
+        <w:rPr>
+          <w:b w:val="false"/>
+          <w:bCs w:val="false"/>
+          <w:lang w:val="hr-HR"/>
+        </w:rPr>
+      </w:pPr>
+      <w:r>
+        <w:rPr>
+          <w:b w:val="false"/>
+          <w:bCs w:val="false"/>
+          <w:lang w:val="hr-HR"/>
+        </w:rPr>
+      </w:r>
+    </w:p>
+    <w:p>
+      <w:pPr>
+        <w:pStyle w:val="Normal"/>
+        <w:bidi w:val="0"/>
+        <w:ind w:hanging="900" w:start="900" w:end="0"/>
+        <w:jc w:val="start"/>
+        <w:rPr>
+          <w:b w:val="false"/>
+          <w:bCs w:val="false"/>
+          <w:lang w:val="hr-HR"/>
+        </w:rPr>
+      </w:pPr>
+      <w:r>
+        <w:rPr>
+          <w:b/>
+          <w:bCs/>
+          <w:lang w:val="hr-HR"/>
+        </w:rPr>
+        <w:t>Huemer:</w:t>
+      </w:r>
+      <w:r>
+        <w:rPr>
+          <w:b w:val="false"/>
+          <w:bCs w:val="false"/>
+          <w:lang w:val="hr-HR"/>
+        </w:rPr>
+        <w:t xml:space="preserve"> </w:t>
+      </w:r>
+      <w:r>
+        <w:rPr>
+          <w:b w:val="false"/>
+          <w:bCs w:val="false"/>
+          <w:lang w:val="hr-HR"/>
+        </w:rPr>
+        <w:t xml:space="preserve">Uostalom, što ćemo s ptičjom gripom uzrokovanom svinjama? </w:t>
       </w:r>
       <w:r>
         <w:rPr>

</xml_diff>

<commit_message>
Added the language joke about the word procarniloquence
</commit_message>
<xml_diff>
--- a/zabranjivanje_mesa.docx
+++ b/zabranjivanje_mesa.docx
@@ -1222,6 +1222,24 @@
         </w:rPr>
         <w:t xml:space="preserve"> Da, je zbog kalcija, ali kako zbog kalcija? Mnogi ljudi to krivo razumiju.</w:t>
       </w:r>
+      <w:r>
+        <w:rPr>
+          <w:b w:val="false"/>
+          <w:bCs w:val="false"/>
+          <w:shd w:fill="FFFF00" w:val="clear"/>
+          <w:lang w:val="hr-HR"/>
+        </w:rPr>
+        <w:t xml:space="preserve"> </w:t>
+      </w:r>
+      <w:r>
+        <w:rPr>
+          <w:b w:val="false"/>
+          <w:bCs w:val="false"/>
+          <w:shd w:fill="FFFF00" w:val="clear"/>
+          <w:lang w:val="hr-HR"/>
+        </w:rPr>
+        <w:t>U stvari, gotovo svi ljudi koji zastupaju tu prokarnilokvenciju da nije meso otrov nego da je povrće prevencija to krivo razumiju.</w:t>
+      </w:r>
     </w:p>
     <w:p>
       <w:pPr>
@@ -1269,7 +1287,16 @@
           <w:bCs w:val="false"/>
           <w:lang w:val="hr-HR"/>
         </w:rPr>
-        <w:t xml:space="preserve"> Pretpostavljam da je tako što Vitamin K čini da kalcij iz krvi ode u kosti, jer je on potreban osteoblastima da ekstrahiraju kalcij iz krvi, pa da u krvi ima manje kalcija i time da se kolesterol manje kalcificira.</w:t>
+        <w:t xml:space="preserve"> Pretpostavljam da je tako što Vitamin K čini da kalcij iz krvi ode u kosti, jer je on potreban osteoblastima da ekstrahiraju kalcij iz krvi, pa da u krvi ima manje kalcija i time da se kolesterol manje kalcificira. </w:t>
+      </w:r>
+      <w:r>
+        <w:rPr>
+          <w:b w:val="false"/>
+          <w:bCs w:val="false"/>
+          <w:shd w:fill="FFFF00" w:val="clear"/>
+          <w:lang w:val="hr-HR"/>
+        </w:rPr>
+        <w:t>I, hajde, molim Vas, nemojte izmišljati latinske riječi kao što je prokarnilokvencija, ne zvučite ništa pametnije zbog toga.</w:t>
       </w:r>
     </w:p>
     <w:p>
@@ -1318,7 +1345,16 @@
           <w:bCs w:val="false"/>
           <w:lang w:val="hr-HR"/>
         </w:rPr>
-        <w:t xml:space="preserve"> Eh, vidite, prijatelju, mnogi to misle, ali nije tako. Kalcij nikada nije ograničavajući faktor u kalcificiranju kolesterola. Uvijek ga ima i više nego dovoljno, inače je čovjek već odavno mrtav. Vitamin K sprječava srčane udare tako što je nužan za proizvodnju enzima Matrični GLA Protein, koji dekalcificira kolesterol u krvi, ali za to je potrebno veoma malo Vitamina K. Iznad oko 30 mikrograma na dan, Vitamin K ne čini da se proizvede više Matričnog GLA Proteina. Prosječan čovjek uzima oko 80 mikrograma Vitamina K na dan.</w:t>
+        <w:t xml:space="preserve"> Eh, vidite, prijatelju, mnogi to misle, ali nije tako. Kalcij nikada nije ograničavajući faktor u kalcificiranju kolesterola. Uvijek ga ima i više nego dovoljno, inače je čovjek već odavno mrtav. Vitamin K sprječava srčane udare tako što je nužan za proizvodnju enzima Matrični GLA Protein, koji dekalcificira kolesterol u krvi, ali za to je potrebno veoma malo Vitamina K. Iznad oko 30 mikrograma na dan, Vitamin K ne čini da se proizvede više Matričnog GLA Proteina. Prosječan čovjek uzima oko 80 mikrograma Vitamina K na dan. </w:t>
+      </w:r>
+      <w:r>
+        <w:rPr>
+          <w:b w:val="false"/>
+          <w:bCs w:val="false"/>
+          <w:shd w:fill="FFFF00" w:val="clear"/>
+          <w:lang w:val="hr-HR"/>
+        </w:rPr>
+        <w:t>Hajde, dobro, neću više koristiti riječ prokarnilokvencija. Uostalom, vjerojatno bi bolja riječ bila nešto kao kreatodicija ili kreatapologija.</w:t>
       </w:r>
     </w:p>
     <w:p>
@@ -2422,16 +2458,7 @@
           <w:shd w:fill="FFFF00" w:val="clear"/>
           <w:lang w:val="hr-HR"/>
         </w:rPr>
-        <w:t xml:space="preserve"> nema </w:t>
-      </w:r>
-      <w:r>
-        <w:rPr>
-          <w:b w:val="false"/>
-          <w:bCs w:val="false"/>
-          <w:shd w:fill="FFFF00" w:val="clear"/>
-          <w:lang w:val="hr-HR"/>
-        </w:rPr>
-        <w:t>takvog matematičkog modela</w:t>
+        <w:t xml:space="preserve"> nema takvog matematičkog modela</w:t>
       </w:r>
       <w:r>
         <w:rPr>
@@ -3239,15 +3266,7 @@
           <w:bCs w:val="false"/>
           <w:lang w:val="hr-HR"/>
         </w:rPr>
-        <w:t xml:space="preserve"> </w:t>
-      </w:r>
-      <w:r>
-        <w:rPr>
-          <w:b w:val="false"/>
-          <w:bCs w:val="false"/>
-          <w:lang w:val="hr-HR"/>
-        </w:rPr>
-        <w:t xml:space="preserve">Uostalom, što ćemo s ptičjom gripom uzrokovanom svinjama? </w:t>
+        <w:t xml:space="preserve"> Uostalom, što ćemo s ptičjom gripom uzrokovanom svinjama? </w:t>
       </w:r>
       <w:r>
         <w:rPr>

</xml_diff>

<commit_message>
Added the boiling frog analogy into the banning meat drama
</commit_message>
<xml_diff>
--- a/zabranjivanje_mesa.docx
+++ b/zabranjivanje_mesa.docx
@@ -106,6 +106,51 @@
         <w:bidi w:val="0"/>
         <w:jc w:val="center"/>
         <w:rPr>
+          <w:b w:val="false"/>
+          <w:bCs w:val="false"/>
+          <w:highlight w:val="none"/>
+          <w:shd w:fill="FFFF00" w:val="clear"/>
+          <w:lang w:val="hr-HR"/>
+        </w:rPr>
+      </w:pPr>
+      <w:r>
+        <w:rPr>
+          <w:b w:val="false"/>
+          <w:bCs w:val="false"/>
+          <w:shd w:fill="FFFF00" w:val="clear"/>
+          <w:lang w:val="hr-HR"/>
+        </w:rPr>
+      </w:r>
+    </w:p>
+    <w:p>
+      <w:pPr>
+        <w:pStyle w:val="Normal"/>
+        <w:bidi w:val="0"/>
+        <w:jc w:val="center"/>
+        <w:rPr>
+          <w:b w:val="false"/>
+          <w:bCs w:val="false"/>
+          <w:highlight w:val="none"/>
+          <w:shd w:fill="FFFF00" w:val="clear"/>
+          <w:lang w:val="hr-HR"/>
+        </w:rPr>
+      </w:pPr>
+      <w:r>
+        <w:rPr>
+          <w:b w:val="false"/>
+          <w:bCs w:val="false"/>
+          <w:shd w:fill="FFFF00" w:val="clear"/>
+          <w:lang w:val="hr-HR"/>
+        </w:rPr>
+        <w:t>U slučaju da to nekome nije očito: Ovo je fikcija, i svaka podudarnost sa stvarnim događajima je slučajna.</w:t>
+      </w:r>
+    </w:p>
+    <w:p>
+      <w:pPr>
+        <w:pStyle w:val="Normal"/>
+        <w:bidi w:val="0"/>
+        <w:jc w:val="center"/>
+        <w:rPr>
           <w:lang w:val="bs-BA"/>
         </w:rPr>
       </w:pPr>
@@ -492,7 +537,16 @@
           <w:bCs w:val="false"/>
           <w:lang w:val="hr-HR"/>
         </w:rPr>
-        <w:t xml:space="preserve"> Ali tvrditi da biljke osjete bol daleko je manje plauzibilno nego tvrditi da kukci ili meduze osjete bol, zbog evolucije. Koja bi bila evolucijska presura na biljke da osjete bol kad ne mogu ništa učiniti po tom pitanju? A i da uzmemo zasigurno da jedino ptice i sisavci mogu osjetiti fizičku bol, to nam ništa ne govori o psihičkoj boli. Sjetimo se Moravecovog paradoksa. Ono što čovjek percipira kao kognitivno lagano ili teško ima veoma malo korelacije s time što umjetna inteligencija percipira kao lagano ili teško, a tko zna kako je s neljudskim životinjama.</w:t>
+        <w:t xml:space="preserve"> Ali tvrditi da biljke osjete bol daleko je manje plauzibilno nego tvrditi da kukci ili meduze osjete bol, zbog evolucije. Koja bi bila evolucijska presura na biljke da osjete bol kad ne mogu ništa učiniti po tom pitanju? A i da uzmemo zasigurno da jedino ptice i sisavci mogu osjetiti fizičku bol, to nam ništa ne govori o psihičkoj boli. Sjetimo se Moravecovog paradoksa. Ono što čovjek percipira kao kognitivno lagano ili teško ima veoma malo korelacije s time što umjetna inteligencija percipira kao lagano ili teško, a tko zna kako je s neljudskim životinjama. </w:t>
+      </w:r>
+      <w:r>
+        <w:rPr>
+          <w:b w:val="false"/>
+          <w:bCs w:val="false"/>
+          <w:shd w:fill="FFFF00" w:val="clear"/>
+          <w:lang w:val="hr-HR"/>
+        </w:rPr>
+        <w:t>Uostalom, već veoma dugo znamo da, ako žabi uklonite mozak, ona će iskočiti iz kipuće vode ako u nju upadne, ali neće iskočiti iz kipuće vode ako je zagrijavanje postupno, dok će žaba koja ima mozak u oba slučaja iskočiti iz kipuće vode. Pa što onda žaba u tom slučaju u svom mozgu osjeća ako ne bol?</w:t>
       </w:r>
     </w:p>
     <w:p>
@@ -1220,25 +1274,7 @@
           <w:shd w:fill="FFFF00" w:val="clear"/>
           <w:lang w:val="hr-HR"/>
         </w:rPr>
-        <w:t xml:space="preserve"> Da, je zbog kalcija, ali kako zbog kalcija? Mnogi ljudi to krivo razumiju.</w:t>
-      </w:r>
-      <w:r>
-        <w:rPr>
-          <w:b w:val="false"/>
-          <w:bCs w:val="false"/>
-          <w:shd w:fill="FFFF00" w:val="clear"/>
-          <w:lang w:val="hr-HR"/>
-        </w:rPr>
-        <w:t xml:space="preserve"> </w:t>
-      </w:r>
-      <w:r>
-        <w:rPr>
-          <w:b w:val="false"/>
-          <w:bCs w:val="false"/>
-          <w:shd w:fill="FFFF00" w:val="clear"/>
-          <w:lang w:val="hr-HR"/>
-        </w:rPr>
-        <w:t>U stvari, gotovo svi ljudi koji zastupaju tu prokarnilokvenciju da nije meso otrov nego da je povrće prevencija to krivo razumiju.</w:t>
+        <w:t xml:space="preserve"> Da, je zbog kalcija, ali kako zbog kalcija? Mnogi ljudi to krivo razumiju. U stvari, gotovo svi ljudi koji zastupaju tu prokarnilokvenciju da nije meso otrov nego da je povrće prevencija to krivo razumiju.</w:t>
       </w:r>
     </w:p>
     <w:p>

</xml_diff>

<commit_message>
Explained the misconception about genophore and plasmids
</commit_message>
<xml_diff>
--- a/zabranjivanje_mesa.docx
+++ b/zabranjivanje_mesa.docx
@@ -2503,6 +2503,384 @@
           <w:lang w:val="hr-HR"/>
         </w:rPr>
         <w:t>. Onda idemo s najboljim matematičkim podacima koje imamo, a to je da većina superbakterija dolazi iz jaja.</w:t>
+      </w:r>
+    </w:p>
+    <w:p>
+      <w:pPr>
+        <w:pStyle w:val="Normal"/>
+        <w:bidi w:val="0"/>
+        <w:ind w:hanging="900" w:start="900" w:end="0"/>
+        <w:jc w:val="start"/>
+        <w:rPr>
+          <w:b w:val="false"/>
+          <w:bCs w:val="false"/>
+          <w:lang w:val="hr-HR"/>
+        </w:rPr>
+      </w:pPr>
+      <w:r>
+        <w:rPr>
+          <w:b w:val="false"/>
+          <w:bCs w:val="false"/>
+          <w:lang w:val="hr-HR"/>
+        </w:rPr>
+      </w:r>
+    </w:p>
+    <w:p>
+      <w:pPr>
+        <w:pStyle w:val="Normal"/>
+        <w:bidi w:val="0"/>
+        <w:ind w:hanging="900" w:start="900" w:end="0"/>
+        <w:jc w:val="start"/>
+        <w:rPr>
+          <w:b w:val="false"/>
+          <w:bCs w:val="false"/>
+          <w:highlight w:val="none"/>
+          <w:shd w:fill="FFBF00" w:val="clear"/>
+          <w:lang w:val="hr-HR"/>
+        </w:rPr>
+      </w:pPr>
+      <w:r>
+        <w:rPr>
+          <w:b/>
+          <w:bCs/>
+          <w:shd w:fill="FFBF00" w:val="clear"/>
+          <w:lang w:val="hr-HR"/>
+        </w:rPr>
+        <w:t>Caplan:</w:t>
+      </w:r>
+      <w:r>
+        <w:rPr>
+          <w:b w:val="false"/>
+          <w:bCs w:val="false"/>
+          <w:shd w:fill="FFBF00" w:val="clear"/>
+          <w:lang w:val="hr-HR"/>
+        </w:rPr>
+        <w:t xml:space="preserve"> Pa i da pretpostavimo da specifičnost otpornosti na antibiotike ne igra veliku ulogu, bakterije koje napadaju i ljude i kokoši rijetke su. A bakterije koje napadaju i krave i ljude relativno su česte. Zar onda svejedno nema smisla pretpostaviti da antibiotici koji se daju kravama imaju veću ulogu u razvoju superbakterija?</w:t>
+      </w:r>
+    </w:p>
+    <w:p>
+      <w:pPr>
+        <w:pStyle w:val="Normal"/>
+        <w:bidi w:val="0"/>
+        <w:ind w:hanging="900" w:start="900" w:end="0"/>
+        <w:jc w:val="start"/>
+        <w:rPr>
+          <w:b w:val="false"/>
+          <w:bCs w:val="false"/>
+          <w:highlight w:val="none"/>
+          <w:shd w:fill="FFBF00" w:val="clear"/>
+          <w:lang w:val="hr-HR"/>
+        </w:rPr>
+      </w:pPr>
+      <w:r>
+        <w:rPr>
+          <w:b w:val="false"/>
+          <w:bCs w:val="false"/>
+          <w:shd w:fill="FFBF00" w:val="clear"/>
+          <w:lang w:val="hr-HR"/>
+        </w:rPr>
+      </w:r>
+    </w:p>
+    <w:p>
+      <w:pPr>
+        <w:pStyle w:val="Normal"/>
+        <w:bidi w:val="0"/>
+        <w:ind w:hanging="900" w:start="900" w:end="0"/>
+        <w:jc w:val="start"/>
+        <w:rPr>
+          <w:b w:val="false"/>
+          <w:bCs w:val="false"/>
+          <w:highlight w:val="none"/>
+          <w:shd w:fill="FFBF00" w:val="clear"/>
+          <w:lang w:val="hr-HR"/>
+        </w:rPr>
+      </w:pPr>
+      <w:r>
+        <w:rPr>
+          <w:b/>
+          <w:bCs/>
+          <w:shd w:fill="FFBF00" w:val="clear"/>
+          <w:lang w:val="hr-HR"/>
+        </w:rPr>
+        <w:t>Huemer:</w:t>
+      </w:r>
+      <w:r>
+        <w:rPr>
+          <w:b w:val="false"/>
+          <w:bCs w:val="false"/>
+          <w:shd w:fill="FFBF00" w:val="clear"/>
+          <w:lang w:val="hr-HR"/>
+        </w:rPr>
+        <w:t xml:space="preserve"> Mislim da vi veoma krivo razumijete problem superbakterija. Što mislite, gdje se u bakteriji nalaze geni za otpornost na antibiotike?</w:t>
+      </w:r>
+    </w:p>
+    <w:p>
+      <w:pPr>
+        <w:pStyle w:val="Normal"/>
+        <w:bidi w:val="0"/>
+        <w:ind w:hanging="900" w:start="900" w:end="0"/>
+        <w:jc w:val="start"/>
+        <w:rPr>
+          <w:b w:val="false"/>
+          <w:bCs w:val="false"/>
+          <w:highlight w:val="none"/>
+          <w:shd w:fill="FFBF00" w:val="clear"/>
+          <w:lang w:val="hr-HR"/>
+        </w:rPr>
+      </w:pPr>
+      <w:r>
+        <w:rPr>
+          <w:b w:val="false"/>
+          <w:bCs w:val="false"/>
+          <w:shd w:fill="FFBF00" w:val="clear"/>
+          <w:lang w:val="hr-HR"/>
+        </w:rPr>
+      </w:r>
+    </w:p>
+    <w:p>
+      <w:pPr>
+        <w:pStyle w:val="Normal"/>
+        <w:bidi w:val="0"/>
+        <w:ind w:hanging="900" w:start="900" w:end="0"/>
+        <w:jc w:val="start"/>
+        <w:rPr>
+          <w:b w:val="false"/>
+          <w:bCs w:val="false"/>
+          <w:highlight w:val="none"/>
+          <w:shd w:fill="FFBF00" w:val="clear"/>
+          <w:lang w:val="hr-HR"/>
+        </w:rPr>
+      </w:pPr>
+      <w:r>
+        <w:rPr>
+          <w:b/>
+          <w:bCs/>
+          <w:shd w:fill="FFBF00" w:val="clear"/>
+          <w:lang w:val="hr-HR"/>
+        </w:rPr>
+        <w:t>Caplan:</w:t>
+      </w:r>
+      <w:r>
+        <w:rPr>
+          <w:b w:val="false"/>
+          <w:bCs w:val="false"/>
+          <w:shd w:fill="FFBF00" w:val="clear"/>
+          <w:lang w:val="hr-HR"/>
+        </w:rPr>
+        <w:t xml:space="preserve"> Pa na genoforu. I to u gotovo svim bakterijama, jedino je u većini bakterija isključena zbog epigenetskih proteina koji se omotavaju oko genofora. A epigenetski se može uključiti ako to okruženje bakterije potiče.</w:t>
+      </w:r>
+    </w:p>
+    <w:p>
+      <w:pPr>
+        <w:pStyle w:val="Normal"/>
+        <w:bidi w:val="0"/>
+        <w:ind w:hanging="900" w:start="900" w:end="0"/>
+        <w:jc w:val="start"/>
+        <w:rPr>
+          <w:b w:val="false"/>
+          <w:bCs w:val="false"/>
+          <w:highlight w:val="none"/>
+          <w:shd w:fill="FFBF00" w:val="clear"/>
+          <w:lang w:val="hr-HR"/>
+        </w:rPr>
+      </w:pPr>
+      <w:r>
+        <w:rPr>
+          <w:b w:val="false"/>
+          <w:bCs w:val="false"/>
+          <w:shd w:fill="FFBF00" w:val="clear"/>
+          <w:lang w:val="hr-HR"/>
+        </w:rPr>
+      </w:r>
+    </w:p>
+    <w:p>
+      <w:pPr>
+        <w:pStyle w:val="Normal"/>
+        <w:bidi w:val="0"/>
+        <w:ind w:hanging="900" w:start="900" w:end="0"/>
+        <w:jc w:val="start"/>
+        <w:rPr>
+          <w:b w:val="false"/>
+          <w:bCs w:val="false"/>
+          <w:highlight w:val="none"/>
+          <w:shd w:fill="FFBF00" w:val="clear"/>
+          <w:lang w:val="hr-HR"/>
+        </w:rPr>
+      </w:pPr>
+      <w:r>
+        <w:rPr>
+          <w:b/>
+          <w:bCs/>
+          <w:shd w:fill="FFBF00" w:val="clear"/>
+          <w:lang w:val="hr-HR"/>
+        </w:rPr>
+        <w:t>Huemer:</w:t>
+      </w:r>
+      <w:r>
+        <w:rPr>
+          <w:b w:val="false"/>
+          <w:bCs w:val="false"/>
+          <w:shd w:fill="FFBF00" w:val="clear"/>
+          <w:lang w:val="hr-HR"/>
+        </w:rPr>
+        <w:t xml:space="preserve"> Eh, vidite, to vam je</w:t>
+      </w:r>
+      <w:r>
+        <w:rPr>
+          <w:b w:val="false"/>
+          <w:bCs w:val="false"/>
+          <w:shd w:fill="FFBF00" w:val="clear"/>
+          <w:lang w:val="en-US"/>
+        </w:rPr>
+        <w:t xml:space="preserve"> </w:t>
+      </w:r>
+      <w:r>
+        <w:rPr>
+          <w:b w:val="false"/>
+          <w:bCs w:val="false"/>
+          <w:shd w:fill="FFBF00" w:val="clear"/>
+          <w:lang w:val="en-US"/>
+        </w:rPr>
+        <w:t>bila</w:t>
+      </w:r>
+      <w:r>
+        <w:rPr>
+          <w:b w:val="false"/>
+          <w:bCs w:val="false"/>
+          <w:shd w:fill="FFBF00" w:val="clear"/>
+          <w:lang w:val="en-US"/>
+        </w:rPr>
+        <w:t xml:space="preserve"> </w:t>
+      </w:r>
+      <w:r>
+        <w:rPr>
+          <w:b w:val="false"/>
+          <w:bCs w:val="false"/>
+          <w:shd w:fill="FFBF00" w:val="clear"/>
+          <w:lang w:val="hr-HR"/>
+        </w:rPr>
+        <w:t xml:space="preserve">lisenkovštinska sovjetska propaganda, i danas znamo zasigurno da to nije istina. Enzimi za razgradju antibiotika u bakterijama se nalaze gotovo isključivo na plazmidima, a ne na genoforu. A plazmidi su geni koji se prenose pri konjugaciji bakterija. Nije važno što bakterije koje napadaju kokoši uglavnom ne napadaju ljude, bitno je da one dolaze u doticaj s bakterijama koje napadaju ljude i konjugacijom primaju njihove plazmide. </w:t>
+      </w:r>
+      <w:r>
+        <w:rPr>
+          <w:b w:val="false"/>
+          <w:bCs w:val="false"/>
+          <w:shd w:fill="FFBF00" w:val="clear"/>
+          <w:lang w:val="hr-HR"/>
+        </w:rPr>
+        <w:t>Gotovo sigurno je glavni uzrok superbakterija kod ljudi konjugacija s bakterijama koje napadaju životinje u intenzivnom uzgoju.</w:t>
+      </w:r>
+    </w:p>
+    <w:p>
+      <w:pPr>
+        <w:pStyle w:val="Normal"/>
+        <w:bidi w:val="0"/>
+        <w:ind w:hanging="900" w:start="900" w:end="0"/>
+        <w:jc w:val="start"/>
+        <w:rPr>
+          <w:b w:val="false"/>
+          <w:bCs w:val="false"/>
+          <w:highlight w:val="none"/>
+          <w:shd w:fill="FFBF00" w:val="clear"/>
+          <w:lang w:val="hr-HR"/>
+        </w:rPr>
+      </w:pPr>
+      <w:r>
+        <w:rPr>
+          <w:b w:val="false"/>
+          <w:bCs w:val="false"/>
+          <w:shd w:fill="FFBF00" w:val="clear"/>
+          <w:lang w:val="hr-HR"/>
+        </w:rPr>
+      </w:r>
+    </w:p>
+    <w:p>
+      <w:pPr>
+        <w:pStyle w:val="Normal"/>
+        <w:bidi w:val="0"/>
+        <w:ind w:hanging="900" w:start="900" w:end="0"/>
+        <w:jc w:val="start"/>
+        <w:rPr>
+          <w:b w:val="false"/>
+          <w:bCs w:val="false"/>
+          <w:highlight w:val="none"/>
+          <w:shd w:fill="FFBF00" w:val="clear"/>
+          <w:lang w:val="hr-HR"/>
+        </w:rPr>
+      </w:pPr>
+      <w:r>
+        <w:rPr>
+          <w:b/>
+          <w:bCs/>
+          <w:shd w:fill="FFBF00" w:val="clear"/>
+          <w:lang w:val="hr-HR"/>
+        </w:rPr>
+        <w:t>Caplan:</w:t>
+      </w:r>
+      <w:r>
+        <w:rPr>
+          <w:b w:val="false"/>
+          <w:bCs w:val="false"/>
+          <w:shd w:fill="FFBF00" w:val="clear"/>
+          <w:lang w:val="hr-HR"/>
+        </w:rPr>
+        <w:t xml:space="preserve"> Ali konjugacija nesrodnih bakterija je rijetka, zar ne? Ima bezbroj vrsta bakterija, i one se ne mogu međusobno razmnožavati i imati plodno potomstvo.</w:t>
+      </w:r>
+    </w:p>
+    <w:p>
+      <w:pPr>
+        <w:pStyle w:val="Normal"/>
+        <w:bidi w:val="0"/>
+        <w:ind w:hanging="900" w:start="900" w:end="0"/>
+        <w:jc w:val="start"/>
+        <w:rPr>
+          <w:b w:val="false"/>
+          <w:bCs w:val="false"/>
+          <w:highlight w:val="none"/>
+          <w:shd w:fill="FFBF00" w:val="clear"/>
+          <w:lang w:val="hr-HR"/>
+        </w:rPr>
+      </w:pPr>
+      <w:r>
+        <w:rPr>
+          <w:b w:val="false"/>
+          <w:bCs w:val="false"/>
+          <w:shd w:fill="FFBF00" w:val="clear"/>
+          <w:lang w:val="hr-HR"/>
+        </w:rPr>
+      </w:r>
+    </w:p>
+    <w:p>
+      <w:pPr>
+        <w:pStyle w:val="Normal"/>
+        <w:bidi w:val="0"/>
+        <w:ind w:hanging="900" w:start="900" w:end="0"/>
+        <w:jc w:val="start"/>
+        <w:rPr>
+          <w:b w:val="false"/>
+          <w:bCs w:val="false"/>
+          <w:highlight w:val="none"/>
+          <w:shd w:fill="FFBF00" w:val="clear"/>
+          <w:lang w:val="hr-HR"/>
+        </w:rPr>
+      </w:pPr>
+      <w:r>
+        <w:rPr>
+          <w:b/>
+          <w:bCs/>
+          <w:shd w:fill="FFBF00" w:val="clear"/>
+          <w:lang w:val="hr-HR"/>
+        </w:rPr>
+        <w:t>Huemer:</w:t>
+      </w:r>
+      <w:r>
+        <w:rPr>
+          <w:b w:val="false"/>
+          <w:bCs w:val="false"/>
+          <w:shd w:fill="FFBF00" w:val="clear"/>
+          <w:lang w:val="hr-HR"/>
+        </w:rPr>
+        <w:t xml:space="preserve"> Ako želite razumjeti genetiku bakterija, uzmite sve što mislite da znate o genetici i bacite to u vodu. To što se u školi uči o genetici aproksimacije su koje donekle vrijede za velike organizme kao što su životinje i biljke, ali ne vrijede ni približno za mikrobe. Ne, bakterije se mogu konjugirati s doslovno milijardama godina udaljenim rođacima. Vrsta se u mikrobiologiji definira nekako komplicirano, i nema nikakve veze s konjugacijom bakterija.</w:t>
       </w:r>
     </w:p>
     <w:p>

</xml_diff>

<commit_message>
Added some prepper rhetoric to the Caplan at the end
</commit_message>
<xml_diff>
--- a/zabranjivanje_mesa.docx
+++ b/zabranjivanje_mesa.docx
@@ -2732,43 +2732,16 @@
           <w:shd w:fill="FFBF00" w:val="clear"/>
           <w:lang w:val="en-US"/>
         </w:rPr>
-        <w:t xml:space="preserve"> </w:t>
+        <w:t xml:space="preserve"> bila </w:t>
       </w:r>
       <w:r>
         <w:rPr>
           <w:b w:val="false"/>
           <w:bCs w:val="false"/>
           <w:shd w:fill="FFBF00" w:val="clear"/>
-          <w:lang w:val="en-US"/>
-        </w:rPr>
-        <w:t>bila</w:t>
-      </w:r>
-      <w:r>
-        <w:rPr>
-          <w:b w:val="false"/>
-          <w:bCs w:val="false"/>
-          <w:shd w:fill="FFBF00" w:val="clear"/>
-          <w:lang w:val="en-US"/>
-        </w:rPr>
-        <w:t xml:space="preserve"> </w:t>
-      </w:r>
-      <w:r>
-        <w:rPr>
-          <w:b w:val="false"/>
-          <w:bCs w:val="false"/>
-          <w:shd w:fill="FFBF00" w:val="clear"/>
-          <w:lang w:val="hr-HR"/>
-        </w:rPr>
-        <w:t xml:space="preserve">lisenkovštinska sovjetska propaganda, i danas znamo zasigurno da to nije istina. Enzimi za razgradju antibiotika u bakterijama se nalaze gotovo isključivo na plazmidima, a ne na genoforu. A plazmidi su geni koji se prenose pri konjugaciji bakterija. Nije važno što bakterije koje napadaju kokoši uglavnom ne napadaju ljude, bitno je da one dolaze u doticaj s bakterijama koje napadaju ljude i konjugacijom primaju njihove plazmide. </w:t>
-      </w:r>
-      <w:r>
-        <w:rPr>
-          <w:b w:val="false"/>
-          <w:bCs w:val="false"/>
-          <w:shd w:fill="FFBF00" w:val="clear"/>
-          <w:lang w:val="hr-HR"/>
-        </w:rPr>
-        <w:t>Gotovo sigurno je glavni uzrok superbakterija kod ljudi konjugacija s bakterijama koje napadaju životinje u intenzivnom uzgoju.</w:t>
+          <w:lang w:val="hr-HR"/>
+        </w:rPr>
+        <w:t>lisenkovštinska sovjetska propaganda, i danas znamo zasigurno da to nije istina. Enzimi za razgradju antibiotika u bakterijama se nalaze gotovo isključivo na plazmidima, a ne na genoforu. A plazmidi su geni koji se prenose pri konjugaciji bakterija. Nije važno što bakterije koje napadaju kokoši uglavnom ne napadaju ljude, bitno je da one dolaze u doticaj s bakterijama koje napadaju ljude i konjugacijom primaju njihove plazmide. Gotovo sigurno je glavni uzrok superbakterija kod ljudi konjugacija s bakterijama koje napadaju životinje u intenzivnom uzgoju.</w:t>
       </w:r>
     </w:p>
     <w:p>
@@ -3888,6 +3861,62 @@
           <w:lang w:val="hr-HR"/>
         </w:rPr>
         <w:t xml:space="preserve"> (Sam sa sobom priča.) Što to uopće znači biti autoritaran kad govorimo o prevenciji pandemije superbakterije? Pandemija superbakterije dat će vladi daleko više moći nego bilo koji rat.</w:t>
+      </w:r>
+    </w:p>
+    <w:p>
+      <w:pPr>
+        <w:pStyle w:val="Normal"/>
+        <w:bidi w:val="0"/>
+        <w:ind w:hanging="900" w:start="900" w:end="0"/>
+        <w:jc w:val="start"/>
+        <w:rPr>
+          <w:b w:val="false"/>
+          <w:bCs w:val="false"/>
+          <w:highlight w:val="none"/>
+          <w:shd w:fill="FFFF00" w:val="clear"/>
+          <w:lang w:val="hr-HR"/>
+        </w:rPr>
+      </w:pPr>
+      <w:r>
+        <w:rPr>
+          <w:b w:val="false"/>
+          <w:bCs w:val="false"/>
+          <w:shd w:fill="FFFF00" w:val="clear"/>
+          <w:lang w:val="hr-HR"/>
+        </w:rPr>
+      </w:r>
+    </w:p>
+    <w:p>
+      <w:pPr>
+        <w:pStyle w:val="Normal"/>
+        <w:bidi w:val="0"/>
+        <w:ind w:hanging="900" w:start="900" w:end="0"/>
+        <w:jc w:val="start"/>
+        <w:rPr>
+          <w:b w:val="false"/>
+          <w:bCs w:val="false"/>
+          <w:highlight w:val="none"/>
+          <w:shd w:fill="FFBF00" w:val="clear"/>
+          <w:lang w:val="hr-HR"/>
+        </w:rPr>
+      </w:pPr>
+      <w:r>
+        <w:rPr>
+          <w:b/>
+          <w:bCs/>
+          <w:shd w:fill="FFBF00" w:val="clear"/>
+          <w:lang w:val="hr-HR"/>
+        </w:rPr>
+        <w:t>Caplan:</w:t>
+      </w:r>
+      <w:r>
+        <w:rPr>
+          <w:b w:val="false"/>
+          <w:bCs w:val="false"/>
+          <w:shd w:fill="FFBF00" w:val="clear"/>
+          <w:lang w:val="hr-HR"/>
+        </w:rPr>
+        <w:t xml:space="preserve"> (Sam sa sobom priča) Što ja znam? Kad bi mi samo netko mogao garantirati da će naša civilizacija propasti tako što će se dogoditi pandemija superbakterije, bio bih i za to da antibiotici budu na recept i možda i za zabranjivanje mesa. Ali načina na koji civilizacija može propasti zaista ima bezbroj. I u većini tih slučajeva mnogo je bolje da svatko u svojoj kućnoj ljekarni ima zalihu antibiotika i drugih esencijalnih lijekova. I ako se globalni lanci opskrbe uruše, zabranjivanje mesa veoma lagano može uzrokovati glad.</w:t>
       </w:r>
     </w:p>
     <w:sectPr>

</xml_diff>